<commit_message>
Actualizar pie de página y agregar descripciones en varias páginas HTML de la terminal de transporte
</commit_message>
<xml_diff>
--- a/documentacion/Anexo3-German-Romero.docx
+++ b/documentacion/Anexo3-German-Romero.docx
@@ -185,57 +185,95 @@
       <w:pPr>
         <w:jc w:val="center"/>
         <w:rPr>
-          <w:b/>
-          <w:szCs w:val="24"/>
-        </w:rPr>
-      </w:pPr>
-      <w:r>
-        <w:rPr>
           <w:rFonts w:cstheme="minorHAnsi"/>
           <w:b/>
           <w:szCs w:val="24"/>
         </w:rPr>
-        <w:t xml:space="preserve">Documentación del Proyecto </w:t>
-      </w:r>
+      </w:pPr>
       <w:r>
         <w:rPr>
           <w:rFonts w:cstheme="minorHAnsi"/>
           <w:b/>
-          <w:color w:val="808080" w:themeColor="background1" w:themeShade="80"/>
-          <w:szCs w:val="24"/>
-        </w:rPr>
-        <w:t>Escriba aquí el nombre del proyecto</w:t>
+          <w:szCs w:val="24"/>
+        </w:rPr>
+        <w:t>Documentación del Proyecto</w:t>
       </w:r>
     </w:p>
     <w:p>
       <w:pPr>
         <w:jc w:val="center"/>
         <w:rPr>
-          <w:b/>
-          <w:szCs w:val="24"/>
-        </w:rPr>
-      </w:pPr>
-    </w:p>
-    <w:p>
-      <w:pPr>
+          <w:rFonts w:cstheme="minorHAnsi"/>
+          <w:b/>
+          <w:szCs w:val="24"/>
+        </w:rPr>
+      </w:pPr>
+      <w:r>
+        <w:rPr>
+          <w:rFonts w:cstheme="minorHAnsi"/>
+          <w:b/>
+          <w:szCs w:val="24"/>
+        </w:rPr>
+        <w:t>Terminal de Transporte</w:t>
+      </w:r>
+    </w:p>
+    <w:p>
+      <w:pPr>
+        <w:jc w:val="center"/>
+        <w:rPr>
+          <w:b/>
+          <w:szCs w:val="24"/>
+        </w:rPr>
+      </w:pPr>
+    </w:p>
+    <w:p>
+      <w:pPr>
+        <w:jc w:val="center"/>
+        <w:rPr>
+          <w:b/>
+          <w:szCs w:val="24"/>
+        </w:rPr>
+      </w:pPr>
+    </w:p>
+    <w:p>
+      <w:pPr>
+        <w:jc w:val="center"/>
+        <w:rPr>
+          <w:b/>
+          <w:szCs w:val="24"/>
+        </w:rPr>
+      </w:pPr>
+    </w:p>
+    <w:p>
+      <w:pPr>
+        <w:jc w:val="center"/>
+        <w:rPr>
+          <w:b/>
+          <w:szCs w:val="24"/>
+        </w:rPr>
+      </w:pPr>
+    </w:p>
+    <w:p>
+      <w:pPr>
+        <w:jc w:val="center"/>
         <w:rPr>
           <w:rFonts w:cs="Times New Roman"/>
           <w:b/>
           <w:szCs w:val="24"/>
         </w:rPr>
       </w:pPr>
-    </w:p>
-    <w:p>
-      <w:pPr>
+      <w:r>
         <w:rPr>
           <w:rFonts w:cs="Times New Roman"/>
           <w:b/>
           <w:szCs w:val="24"/>
         </w:rPr>
-      </w:pPr>
-    </w:p>
-    <w:p>
-      <w:pPr>
+        <w:t>Etapa 2 - Diseño de aplicaciones web estáticas</w:t>
+      </w:r>
+    </w:p>
+    <w:p>
+      <w:pPr>
+        <w:jc w:val="center"/>
         <w:rPr>
           <w:rFonts w:cs="Times New Roman"/>
           <w:b/>
@@ -245,6 +283,7 @@
     </w:p>
     <w:p>
       <w:pPr>
+        <w:jc w:val="center"/>
         <w:rPr>
           <w:rFonts w:cs="Times New Roman"/>
           <w:b/>
@@ -261,13 +300,23 @@
           <w:szCs w:val="24"/>
         </w:rPr>
       </w:pPr>
-      <w:r>
+    </w:p>
+    <w:p>
+      <w:pPr>
+        <w:jc w:val="center"/>
         <w:rPr>
           <w:rFonts w:cs="Times New Roman"/>
           <w:b/>
           <w:szCs w:val="24"/>
         </w:rPr>
-        <w:t>NOMBRE DE LA ACTIVIDAD</w:t>
+      </w:pPr>
+      <w:r>
+        <w:rPr>
+          <w:rFonts w:cs="Times New Roman"/>
+          <w:b/>
+          <w:szCs w:val="24"/>
+        </w:rPr>
+        <w:t>Germán Andrés Romero León</w:t>
       </w:r>
     </w:p>
     <w:p>
@@ -279,16 +328,56 @@
           <w:szCs w:val="24"/>
         </w:rPr>
       </w:pPr>
+      <w:r>
+        <w:rPr>
+          <w:rFonts w:cs="Times New Roman"/>
+          <w:b/>
+          <w:szCs w:val="24"/>
+        </w:rPr>
+        <w:t>202047916_24</w:t>
+      </w:r>
     </w:p>
     <w:p>
       <w:pPr>
         <w:jc w:val="center"/>
         <w:rPr>
+          <w:b/>
+        </w:rPr>
+      </w:pPr>
+    </w:p>
+    <w:p>
+      <w:pPr>
+        <w:jc w:val="center"/>
+        <w:rPr>
+          <w:b/>
+        </w:rPr>
+      </w:pPr>
+    </w:p>
+    <w:p>
+      <w:pPr>
+        <w:jc w:val="center"/>
+        <w:rPr>
+          <w:b/>
+        </w:rPr>
+      </w:pPr>
+    </w:p>
+    <w:p>
+      <w:pPr>
+        <w:jc w:val="center"/>
+        <w:rPr>
           <w:rFonts w:cs="Times New Roman"/>
           <w:b/>
           <w:szCs w:val="24"/>
         </w:rPr>
       </w:pPr>
+      <w:r>
+        <w:rPr>
+          <w:rFonts w:cs="Times New Roman"/>
+          <w:b/>
+          <w:szCs w:val="24"/>
+        </w:rPr>
+        <w:t>Tutor</w:t>
+      </w:r>
     </w:p>
     <w:p>
       <w:pPr>
@@ -299,6 +388,14 @@
           <w:szCs w:val="24"/>
         </w:rPr>
       </w:pPr>
+      <w:r>
+        <w:rPr>
+          <w:rFonts w:cs="Times New Roman"/>
+          <w:b/>
+          <w:szCs w:val="24"/>
+        </w:rPr>
+        <w:t>Jorge Leonardo Ramírez Restrepo</w:t>
+      </w:r>
     </w:p>
     <w:p>
       <w:pPr>
@@ -309,128 +406,30 @@
           <w:szCs w:val="24"/>
         </w:rPr>
       </w:pPr>
-      <w:r>
+    </w:p>
+    <w:p>
+      <w:pPr>
+        <w:jc w:val="center"/>
         <w:rPr>
           <w:rFonts w:cs="Times New Roman"/>
           <w:b/>
           <w:szCs w:val="24"/>
         </w:rPr>
-        <w:t>Nombre del estudiante</w:t>
-      </w:r>
-    </w:p>
-    <w:p>
-      <w:pPr>
-        <w:pStyle w:val="Ttulo3"/>
-        <w:spacing w:before="150" w:after="150"/>
+      </w:pPr>
+    </w:p>
+    <w:p>
+      <w:pPr>
         <w:jc w:val="center"/>
         <w:rPr>
-          <w:rFonts w:ascii="Verdana" w:hAnsi="Verdana"/>
-          <w:b/>
-        </w:rPr>
-      </w:pPr>
-      <w:r>
-        <w:rPr>
-          <w:rFonts w:ascii="Verdana" w:hAnsi="Verdana"/>
-        </w:rPr>
-        <w:t xml:space="preserve">Grupo Colaborativo </w:t>
-      </w:r>
-      <w:r>
-        <w:rPr>
-          <w:rFonts w:ascii="Verdana" w:hAnsi="Verdana" w:cs="Helvetica"/>
-        </w:rPr>
-        <w:br/>
-      </w:r>
+          <w:rFonts w:cs="Times New Roman"/>
+          <w:b/>
+          <w:szCs w:val="24"/>
+        </w:rPr>
+      </w:pPr>
     </w:p>
     <w:p>
       <w:pPr>
         <w:jc w:val="center"/>
-        <w:rPr>
-          <w:rFonts w:cs="Times New Roman"/>
-          <w:b/>
-          <w:szCs w:val="24"/>
-        </w:rPr>
-      </w:pPr>
-    </w:p>
-    <w:p>
-      <w:pPr>
-        <w:jc w:val="center"/>
-        <w:rPr>
-          <w:rFonts w:cs="Times New Roman"/>
-          <w:b/>
-          <w:szCs w:val="24"/>
-        </w:rPr>
-      </w:pPr>
-    </w:p>
-    <w:p>
-      <w:pPr>
-        <w:jc w:val="center"/>
-        <w:rPr>
-          <w:rFonts w:cs="Times New Roman"/>
-          <w:b/>
-          <w:szCs w:val="24"/>
-        </w:rPr>
-      </w:pPr>
-    </w:p>
-    <w:p>
-      <w:pPr>
-        <w:jc w:val="center"/>
-        <w:rPr>
-          <w:rFonts w:cs="Times New Roman"/>
-          <w:b/>
-          <w:szCs w:val="24"/>
-        </w:rPr>
-      </w:pPr>
-      <w:r>
-        <w:rPr>
-          <w:rFonts w:cs="Times New Roman"/>
-          <w:b/>
-          <w:szCs w:val="24"/>
-        </w:rPr>
-        <w:t>Tutor</w:t>
-      </w:r>
-    </w:p>
-    <w:p>
-      <w:pPr>
-        <w:jc w:val="center"/>
-        <w:rPr>
-          <w:rFonts w:cs="Times New Roman"/>
-          <w:b/>
-          <w:szCs w:val="24"/>
-        </w:rPr>
-      </w:pPr>
-      <w:r>
-        <w:rPr>
-          <w:rFonts w:cs="Times New Roman"/>
-          <w:b/>
-          <w:szCs w:val="24"/>
-        </w:rPr>
-        <w:t>NOMBRE DEL TUTOR</w:t>
-      </w:r>
-    </w:p>
-    <w:p>
-      <w:pPr>
-        <w:spacing w:line="480" w:lineRule="auto"/>
-        <w:jc w:val="center"/>
-        <w:rPr>
-          <w:rFonts w:cs="Times New Roman"/>
-          <w:b/>
-          <w:szCs w:val="24"/>
-        </w:rPr>
-      </w:pPr>
-    </w:p>
-    <w:p>
-      <w:pPr>
-        <w:spacing w:line="240" w:lineRule="auto"/>
-        <w:rPr>
-          <w:rFonts w:cs="Times New Roman"/>
-          <w:b/>
-          <w:szCs w:val="24"/>
-        </w:rPr>
-      </w:pPr>
-    </w:p>
-    <w:p>
-      <w:pPr>
-        <w:spacing w:line="240" w:lineRule="auto"/>
         <w:rPr>
           <w:rFonts w:cs="Times New Roman"/>
           <w:b/>
@@ -511,7 +510,7 @@
           <w:b/>
           <w:szCs w:val="24"/>
         </w:rPr>
-        <w:t>CIUDAD</w:t>
+        <w:t>ANPOIMA</w:t>
       </w:r>
     </w:p>
     <w:p>
@@ -530,7 +529,7 @@
           <w:b/>
           <w:szCs w:val="24"/>
         </w:rPr>
-        <w:t>AÑO</w:t>
+        <w:t>2025</w:t>
       </w:r>
     </w:p>
     <w:p>
@@ -2851,46 +2850,721 @@
       <w:r>
         <w:rPr>
           <w:rFonts w:eastAsia="Times New Roman" w:cs="Times New Roman"/>
-          <w:szCs w:val="24"/>
-        </w:rPr>
-        <w:t xml:space="preserve">Acá se debe documentar las especificaciones técnicas para el desarrollo Web, así como los recursos de hardware, software y humano para el diseño web.  </w:t>
-      </w:r>
-    </w:p>
-    <w:p>
-      <w:pPr>
-        <w:shd w:val="clear" w:color="auto" w:fill="FFFFFF"/>
-        <w:spacing w:after="100" w:afterAutospacing="1" w:line="240" w:lineRule="auto"/>
-        <w:rPr>
-          <w:rFonts w:eastAsia="Times New Roman" w:cs="Segoe UI"/>
           <w:b/>
           <w:bCs/>
-          <w:color w:val="0000FF"/>
-          <w:szCs w:val="24"/>
-          <w:lang w:eastAsia="es-CO"/>
-        </w:rPr>
-      </w:pPr>
-      <w:r>
-        <w:rPr>
-          <w:rFonts w:eastAsia="Times New Roman" w:cs="Segoe UI"/>
+          <w:szCs w:val="24"/>
+        </w:rPr>
+        <w:t>Tipo de aplicación</w:t>
+      </w:r>
+      <w:r>
+        <w:rPr>
+          <w:rFonts w:eastAsia="Times New Roman" w:cs="Times New Roman"/>
+          <w:szCs w:val="24"/>
+        </w:rPr>
+        <w:t xml:space="preserve">: Web </w:t>
+      </w:r>
+      <w:r>
+        <w:rPr>
+          <w:rFonts w:eastAsia="Times New Roman" w:cs="Times New Roman"/>
+          <w:szCs w:val="24"/>
+        </w:rPr>
+        <w:t xml:space="preserve">estática </w:t>
+      </w:r>
+      <w:r>
+        <w:rPr>
+          <w:rFonts w:eastAsia="Times New Roman" w:cs="Times New Roman"/>
+          <w:szCs w:val="24"/>
+        </w:rPr>
+        <w:t>informativa</w:t>
+      </w:r>
+      <w:r>
+        <w:rPr>
+          <w:rFonts w:eastAsia="Times New Roman" w:cs="Times New Roman"/>
+          <w:szCs w:val="24"/>
+        </w:rPr>
+        <w:t xml:space="preserve">, </w:t>
+      </w:r>
+      <w:r>
+        <w:rPr>
+          <w:rFonts w:eastAsia="Times New Roman" w:cs="Times New Roman"/>
+          <w:szCs w:val="24"/>
+        </w:rPr>
+        <w:t>con algunos elementos dinámicos simples.</w:t>
+      </w:r>
+    </w:p>
+    <w:p>
+      <w:pPr>
+        <w:jc w:val="both"/>
+        <w:rPr>
+          <w:rFonts w:eastAsia="Times New Roman" w:cs="Times New Roman"/>
+          <w:szCs w:val="24"/>
+        </w:rPr>
+      </w:pPr>
+      <w:r>
+        <w:rPr>
+          <w:rFonts w:eastAsia="Times New Roman" w:cs="Times New Roman"/>
           <w:b/>
           <w:bCs/>
-          <w:color w:val="FF0000"/>
-          <w:szCs w:val="24"/>
-          <w:lang w:eastAsia="es-CO"/>
-        </w:rPr>
-        <w:t>¡Advertencia!</w:t>
-      </w:r>
-      <w:r>
-        <w:rPr>
-          <w:rFonts w:eastAsia="Times New Roman" w:cs="Segoe UI"/>
+          <w:szCs w:val="24"/>
+        </w:rPr>
+        <w:t>Tecnologías a utilizar</w:t>
+      </w:r>
+      <w:r>
+        <w:rPr>
+          <w:rFonts w:eastAsia="Times New Roman" w:cs="Times New Roman"/>
+          <w:szCs w:val="24"/>
+        </w:rPr>
+        <w:t>:</w:t>
+      </w:r>
+    </w:p>
+    <w:p>
+      <w:pPr>
+        <w:pStyle w:val="Prrafodelista"/>
+        <w:numPr>
+          <w:ilvl w:val="0"/>
+          <w:numId w:val="21"/>
+        </w:numPr>
+        <w:jc w:val="both"/>
+        <w:rPr>
+          <w:rFonts w:eastAsia="Times New Roman" w:cs="Times New Roman"/>
+          <w:szCs w:val="24"/>
+        </w:rPr>
+      </w:pPr>
+      <w:r>
+        <w:rPr>
+          <w:rFonts w:eastAsia="Times New Roman" w:cs="Times New Roman"/>
+          <w:szCs w:val="24"/>
+        </w:rPr>
+        <w:t>HTML</w:t>
+      </w:r>
+    </w:p>
+    <w:p>
+      <w:pPr>
+        <w:pStyle w:val="Prrafodelista"/>
+        <w:numPr>
+          <w:ilvl w:val="0"/>
+          <w:numId w:val="21"/>
+        </w:numPr>
+        <w:jc w:val="both"/>
+        <w:rPr>
+          <w:rFonts w:eastAsia="Times New Roman" w:cs="Times New Roman"/>
+          <w:szCs w:val="24"/>
+        </w:rPr>
+      </w:pPr>
+      <w:r>
+        <w:rPr>
+          <w:rFonts w:eastAsia="Times New Roman" w:cs="Times New Roman"/>
+          <w:szCs w:val="24"/>
+        </w:rPr>
+        <w:t>CSS</w:t>
+      </w:r>
+    </w:p>
+    <w:p>
+      <w:pPr>
+        <w:pStyle w:val="Prrafodelista"/>
+        <w:numPr>
+          <w:ilvl w:val="0"/>
+          <w:numId w:val="21"/>
+        </w:numPr>
+        <w:jc w:val="both"/>
+        <w:rPr>
+          <w:rFonts w:eastAsia="Times New Roman" w:cs="Times New Roman"/>
+          <w:szCs w:val="24"/>
+        </w:rPr>
+      </w:pPr>
+      <w:r>
+        <w:rPr>
+          <w:rFonts w:eastAsia="Times New Roman" w:cs="Times New Roman"/>
+          <w:szCs w:val="24"/>
+        </w:rPr>
+        <w:t>JavaScript.</w:t>
+      </w:r>
+    </w:p>
+    <w:p>
+      <w:pPr>
+        <w:jc w:val="both"/>
+        <w:rPr>
+          <w:rFonts w:eastAsia="Times New Roman" w:cs="Times New Roman"/>
+          <w:szCs w:val="24"/>
+        </w:rPr>
+      </w:pPr>
+      <w:r>
+        <w:rPr>
+          <w:rFonts w:eastAsia="Times New Roman" w:cs="Times New Roman"/>
           <w:b/>
           <w:bCs/>
-          <w:color w:val="0000FF"/>
-          <w:szCs w:val="24"/>
-          <w:lang w:eastAsia="es-CO"/>
-        </w:rPr>
-        <w:t> Cuando tenga claras las anteriores instrucciones y haya configurado el documento en normas APA 7.0, borre esta información.</w:t>
-      </w:r>
+          <w:szCs w:val="24"/>
+        </w:rPr>
+        <w:t>Estructura del sitio web</w:t>
+      </w:r>
+      <w:r>
+        <w:rPr>
+          <w:rFonts w:eastAsia="Times New Roman" w:cs="Times New Roman"/>
+          <w:szCs w:val="24"/>
+        </w:rPr>
+        <w:t>:</w:t>
+      </w:r>
+    </w:p>
+    <w:p>
+      <w:pPr>
+        <w:pStyle w:val="Prrafodelista"/>
+        <w:numPr>
+          <w:ilvl w:val="0"/>
+          <w:numId w:val="21"/>
+        </w:numPr>
+        <w:jc w:val="both"/>
+        <w:rPr>
+          <w:rFonts w:eastAsia="Times New Roman" w:cs="Times New Roman"/>
+          <w:szCs w:val="24"/>
+        </w:rPr>
+      </w:pPr>
+      <w:r>
+        <w:rPr>
+          <w:rFonts w:eastAsia="Times New Roman" w:cs="Times New Roman"/>
+          <w:szCs w:val="24"/>
+        </w:rPr>
+        <w:t>Inicio: Información general de la terminal y bienvenida.</w:t>
+      </w:r>
+    </w:p>
+    <w:p>
+      <w:pPr>
+        <w:pStyle w:val="Prrafodelista"/>
+        <w:numPr>
+          <w:ilvl w:val="0"/>
+          <w:numId w:val="21"/>
+        </w:numPr>
+        <w:jc w:val="both"/>
+        <w:rPr>
+          <w:rFonts w:eastAsia="Times New Roman" w:cs="Times New Roman"/>
+          <w:szCs w:val="24"/>
+        </w:rPr>
+      </w:pPr>
+      <w:r>
+        <w:rPr>
+          <w:rFonts w:eastAsia="Times New Roman" w:cs="Times New Roman"/>
+          <w:szCs w:val="24"/>
+        </w:rPr>
+        <w:t>Empresas de transporte: Listado con datos y contactos.</w:t>
+      </w:r>
+    </w:p>
+    <w:p>
+      <w:pPr>
+        <w:pStyle w:val="Prrafodelista"/>
+        <w:numPr>
+          <w:ilvl w:val="0"/>
+          <w:numId w:val="21"/>
+        </w:numPr>
+        <w:jc w:val="both"/>
+        <w:rPr>
+          <w:rFonts w:eastAsia="Times New Roman" w:cs="Times New Roman"/>
+          <w:szCs w:val="24"/>
+        </w:rPr>
+      </w:pPr>
+      <w:r>
+        <w:rPr>
+          <w:rFonts w:eastAsia="Times New Roman" w:cs="Times New Roman"/>
+          <w:szCs w:val="24"/>
+        </w:rPr>
+        <w:t>Vehículos: Tipos y capacidades.</w:t>
+      </w:r>
+    </w:p>
+    <w:p>
+      <w:pPr>
+        <w:pStyle w:val="Prrafodelista"/>
+        <w:numPr>
+          <w:ilvl w:val="0"/>
+          <w:numId w:val="21"/>
+        </w:numPr>
+        <w:jc w:val="both"/>
+        <w:rPr>
+          <w:rFonts w:eastAsia="Times New Roman" w:cs="Times New Roman"/>
+          <w:szCs w:val="24"/>
+        </w:rPr>
+      </w:pPr>
+      <w:r>
+        <w:rPr>
+          <w:rFonts w:eastAsia="Times New Roman" w:cs="Times New Roman"/>
+          <w:szCs w:val="24"/>
+        </w:rPr>
+        <w:t>Rutas y destinos: Listado de rutas con paradas y distancias.</w:t>
+      </w:r>
+    </w:p>
+    <w:p>
+      <w:pPr>
+        <w:pStyle w:val="Prrafodelista"/>
+        <w:numPr>
+          <w:ilvl w:val="0"/>
+          <w:numId w:val="21"/>
+        </w:numPr>
+        <w:jc w:val="both"/>
+        <w:rPr>
+          <w:rFonts w:eastAsia="Times New Roman" w:cs="Times New Roman"/>
+          <w:szCs w:val="24"/>
+        </w:rPr>
+      </w:pPr>
+      <w:r>
+        <w:rPr>
+          <w:rFonts w:eastAsia="Times New Roman" w:cs="Times New Roman"/>
+          <w:szCs w:val="24"/>
+        </w:rPr>
+        <w:t xml:space="preserve">Cotizaciones: </w:t>
+      </w:r>
+      <w:r>
+        <w:rPr>
+          <w:rFonts w:eastAsia="Times New Roman" w:cs="Times New Roman"/>
+          <w:szCs w:val="24"/>
+        </w:rPr>
+        <w:t>Cotización</w:t>
+      </w:r>
+      <w:r>
+        <w:rPr>
+          <w:rFonts w:eastAsia="Times New Roman" w:cs="Times New Roman"/>
+          <w:szCs w:val="24"/>
+        </w:rPr>
+        <w:t xml:space="preserve"> simple para grupos.</w:t>
+      </w:r>
+    </w:p>
+    <w:p>
+      <w:pPr>
+        <w:pStyle w:val="Prrafodelista"/>
+        <w:numPr>
+          <w:ilvl w:val="0"/>
+          <w:numId w:val="21"/>
+        </w:numPr>
+        <w:jc w:val="both"/>
+        <w:rPr>
+          <w:rFonts w:eastAsia="Times New Roman" w:cs="Times New Roman"/>
+          <w:szCs w:val="24"/>
+        </w:rPr>
+      </w:pPr>
+      <w:r>
+        <w:rPr>
+          <w:rFonts w:eastAsia="Times New Roman" w:cs="Times New Roman"/>
+          <w:szCs w:val="24"/>
+        </w:rPr>
+        <w:t>Compra</w:t>
+      </w:r>
+      <w:r>
+        <w:rPr>
+          <w:rFonts w:eastAsia="Times New Roman" w:cs="Times New Roman"/>
+          <w:szCs w:val="24"/>
+        </w:rPr>
+        <w:t xml:space="preserve"> de tiquetes: </w:t>
+      </w:r>
+      <w:r>
+        <w:rPr>
+          <w:rFonts w:eastAsia="Times New Roman" w:cs="Times New Roman"/>
+          <w:szCs w:val="24"/>
+        </w:rPr>
+        <w:t xml:space="preserve">Sección para la compra de </w:t>
+      </w:r>
+      <w:proofErr w:type="gramStart"/>
+      <w:r>
+        <w:rPr>
+          <w:rFonts w:eastAsia="Times New Roman" w:cs="Times New Roman"/>
+          <w:szCs w:val="24"/>
+        </w:rPr>
+        <w:t>tickets</w:t>
+      </w:r>
+      <w:proofErr w:type="gramEnd"/>
+      <w:r>
+        <w:rPr>
+          <w:rFonts w:eastAsia="Times New Roman" w:cs="Times New Roman"/>
+          <w:szCs w:val="24"/>
+        </w:rPr>
+        <w:t xml:space="preserve"> en línea, con diferentes métodos de pago.</w:t>
+      </w:r>
+    </w:p>
+    <w:p>
+      <w:pPr>
+        <w:jc w:val="both"/>
+        <w:rPr>
+          <w:rFonts w:eastAsia="Times New Roman" w:cs="Times New Roman"/>
+          <w:szCs w:val="24"/>
+        </w:rPr>
+      </w:pPr>
+      <w:r>
+        <w:rPr>
+          <w:rFonts w:eastAsia="Times New Roman" w:cs="Times New Roman"/>
+          <w:b/>
+          <w:bCs/>
+          <w:szCs w:val="24"/>
+        </w:rPr>
+        <w:t>Recursos de hardware</w:t>
+      </w:r>
+      <w:r>
+        <w:rPr>
+          <w:rFonts w:eastAsia="Times New Roman" w:cs="Times New Roman"/>
+          <w:szCs w:val="24"/>
+        </w:rPr>
+        <w:t>:</w:t>
+      </w:r>
+    </w:p>
+    <w:p>
+      <w:pPr>
+        <w:pStyle w:val="Prrafodelista"/>
+        <w:numPr>
+          <w:ilvl w:val="0"/>
+          <w:numId w:val="28"/>
+        </w:numPr>
+        <w:jc w:val="both"/>
+        <w:rPr>
+          <w:rFonts w:eastAsia="Times New Roman" w:cs="Times New Roman"/>
+          <w:szCs w:val="24"/>
+        </w:rPr>
+      </w:pPr>
+      <w:r>
+        <w:rPr>
+          <w:rFonts w:eastAsia="Times New Roman" w:cs="Times New Roman"/>
+          <w:szCs w:val="24"/>
+        </w:rPr>
+        <w:t>Computador de desarrollo</w:t>
+      </w:r>
+      <w:r>
+        <w:rPr>
+          <w:rFonts w:eastAsia="Times New Roman" w:cs="Times New Roman"/>
+          <w:szCs w:val="24"/>
+        </w:rPr>
+        <w:t xml:space="preserve">: </w:t>
+      </w:r>
+      <w:r>
+        <w:rPr>
+          <w:rFonts w:eastAsia="Times New Roman" w:cs="Times New Roman"/>
+          <w:szCs w:val="24"/>
+        </w:rPr>
+        <w:t>Programación, pruebas y diseño</w:t>
+      </w:r>
+      <w:r>
+        <w:rPr>
+          <w:rFonts w:eastAsia="Times New Roman" w:cs="Times New Roman"/>
+          <w:szCs w:val="24"/>
+        </w:rPr>
+        <w:t>.</w:t>
+      </w:r>
+    </w:p>
+    <w:p>
+      <w:pPr>
+        <w:jc w:val="both"/>
+        <w:rPr>
+          <w:rFonts w:eastAsia="Times New Roman" w:cs="Times New Roman"/>
+          <w:szCs w:val="24"/>
+        </w:rPr>
+      </w:pPr>
+      <w:r>
+        <w:rPr>
+          <w:rFonts w:eastAsia="Times New Roman" w:cs="Times New Roman"/>
+          <w:b/>
+          <w:bCs/>
+          <w:szCs w:val="24"/>
+        </w:rPr>
+        <w:t>Recursos de software</w:t>
+      </w:r>
+      <w:r>
+        <w:rPr>
+          <w:rFonts w:eastAsia="Times New Roman" w:cs="Times New Roman"/>
+          <w:szCs w:val="24"/>
+        </w:rPr>
+        <w:t>:</w:t>
+      </w:r>
+    </w:p>
+    <w:p>
+      <w:pPr>
+        <w:pStyle w:val="Prrafodelista"/>
+        <w:numPr>
+          <w:ilvl w:val="0"/>
+          <w:numId w:val="28"/>
+        </w:numPr>
+        <w:jc w:val="both"/>
+        <w:rPr>
+          <w:rFonts w:eastAsia="Times New Roman" w:cs="Times New Roman"/>
+          <w:szCs w:val="24"/>
+        </w:rPr>
+      </w:pPr>
+      <w:r>
+        <w:rPr>
+          <w:rFonts w:eastAsia="Times New Roman" w:cs="Times New Roman"/>
+          <w:szCs w:val="24"/>
+        </w:rPr>
+        <w:t>Visual Studio Code</w:t>
+      </w:r>
+      <w:r>
+        <w:rPr>
+          <w:rFonts w:eastAsia="Times New Roman" w:cs="Times New Roman"/>
+          <w:szCs w:val="24"/>
+        </w:rPr>
+        <w:t xml:space="preserve">: </w:t>
+      </w:r>
+      <w:r>
+        <w:rPr>
+          <w:rFonts w:eastAsia="Times New Roman" w:cs="Times New Roman"/>
+          <w:szCs w:val="24"/>
+        </w:rPr>
+        <w:t>Editor de código</w:t>
+      </w:r>
+      <w:r>
+        <w:rPr>
+          <w:rFonts w:eastAsia="Times New Roman" w:cs="Times New Roman"/>
+          <w:szCs w:val="24"/>
+        </w:rPr>
+        <w:t>.</w:t>
+      </w:r>
+    </w:p>
+    <w:p>
+      <w:pPr>
+        <w:pStyle w:val="Prrafodelista"/>
+        <w:numPr>
+          <w:ilvl w:val="0"/>
+          <w:numId w:val="28"/>
+        </w:numPr>
+        <w:jc w:val="both"/>
+        <w:rPr>
+          <w:rFonts w:eastAsia="Times New Roman" w:cs="Times New Roman"/>
+          <w:szCs w:val="24"/>
+        </w:rPr>
+      </w:pPr>
+      <w:r>
+        <w:rPr>
+          <w:rFonts w:eastAsia="Times New Roman" w:cs="Times New Roman"/>
+          <w:szCs w:val="24"/>
+        </w:rPr>
+        <w:t>Google Chrome</w:t>
+      </w:r>
+      <w:r>
+        <w:rPr>
+          <w:rFonts w:eastAsia="Times New Roman" w:cs="Times New Roman"/>
+          <w:szCs w:val="24"/>
+        </w:rPr>
+        <w:t xml:space="preserve">: </w:t>
+      </w:r>
+      <w:r>
+        <w:rPr>
+          <w:rFonts w:eastAsia="Times New Roman" w:cs="Times New Roman"/>
+          <w:szCs w:val="24"/>
+        </w:rPr>
+        <w:t>Navegador</w:t>
+      </w:r>
+      <w:r>
+        <w:rPr>
+          <w:rFonts w:eastAsia="Times New Roman" w:cs="Times New Roman"/>
+          <w:szCs w:val="24"/>
+        </w:rPr>
+        <w:t>.</w:t>
+      </w:r>
+    </w:p>
+    <w:p>
+      <w:pPr>
+        <w:pStyle w:val="Prrafodelista"/>
+        <w:numPr>
+          <w:ilvl w:val="0"/>
+          <w:numId w:val="28"/>
+        </w:numPr>
+        <w:jc w:val="both"/>
+        <w:rPr>
+          <w:rFonts w:eastAsia="Times New Roman" w:cs="Times New Roman"/>
+          <w:szCs w:val="24"/>
+        </w:rPr>
+      </w:pPr>
+      <w:proofErr w:type="spellStart"/>
+      <w:r>
+        <w:rPr>
+          <w:rFonts w:eastAsia="Times New Roman" w:cs="Times New Roman"/>
+          <w:szCs w:val="24"/>
+        </w:rPr>
+        <w:t>Canva</w:t>
+      </w:r>
+      <w:proofErr w:type="spellEnd"/>
+      <w:r>
+        <w:rPr>
+          <w:rFonts w:eastAsia="Times New Roman" w:cs="Times New Roman"/>
+          <w:szCs w:val="24"/>
+        </w:rPr>
+        <w:t xml:space="preserve">: </w:t>
+      </w:r>
+      <w:r>
+        <w:rPr>
+          <w:rFonts w:eastAsia="Times New Roman" w:cs="Times New Roman"/>
+          <w:szCs w:val="24"/>
+        </w:rPr>
+        <w:t>Diseño visual de la interfaz</w:t>
+      </w:r>
+      <w:r>
+        <w:rPr>
+          <w:rFonts w:eastAsia="Times New Roman" w:cs="Times New Roman"/>
+          <w:szCs w:val="24"/>
+        </w:rPr>
+        <w:t>.</w:t>
+      </w:r>
+    </w:p>
+    <w:p>
+      <w:pPr>
+        <w:pStyle w:val="Prrafodelista"/>
+        <w:numPr>
+          <w:ilvl w:val="0"/>
+          <w:numId w:val="28"/>
+        </w:numPr>
+        <w:jc w:val="both"/>
+        <w:rPr>
+          <w:rFonts w:eastAsia="Times New Roman" w:cs="Times New Roman"/>
+          <w:szCs w:val="24"/>
+        </w:rPr>
+      </w:pPr>
+      <w:r>
+        <w:rPr>
+          <w:rFonts w:eastAsia="Times New Roman" w:cs="Times New Roman"/>
+          <w:szCs w:val="24"/>
+        </w:rPr>
+        <w:t>Git y GitHub</w:t>
+      </w:r>
+      <w:r>
+        <w:rPr>
+          <w:rFonts w:eastAsia="Times New Roman" w:cs="Times New Roman"/>
+          <w:szCs w:val="24"/>
+        </w:rPr>
+        <w:t xml:space="preserve">: </w:t>
+      </w:r>
+      <w:r>
+        <w:rPr>
+          <w:rFonts w:eastAsia="Times New Roman" w:cs="Times New Roman"/>
+          <w:szCs w:val="24"/>
+        </w:rPr>
+        <w:t>Control de versiones</w:t>
+      </w:r>
+      <w:r>
+        <w:rPr>
+          <w:rFonts w:eastAsia="Times New Roman" w:cs="Times New Roman"/>
+          <w:szCs w:val="24"/>
+        </w:rPr>
+        <w:t>.</w:t>
+      </w:r>
+    </w:p>
+    <w:p>
+      <w:pPr>
+        <w:pStyle w:val="Prrafodelista"/>
+        <w:numPr>
+          <w:ilvl w:val="0"/>
+          <w:numId w:val="28"/>
+        </w:numPr>
+        <w:jc w:val="both"/>
+        <w:rPr>
+          <w:rFonts w:eastAsia="Times New Roman" w:cs="Times New Roman"/>
+          <w:szCs w:val="24"/>
+        </w:rPr>
+      </w:pPr>
+      <w:r>
+        <w:rPr>
+          <w:rFonts w:eastAsia="Times New Roman" w:cs="Times New Roman"/>
+          <w:szCs w:val="24"/>
+        </w:rPr>
+        <w:t>GitHub Pages</w:t>
+      </w:r>
+      <w:r>
+        <w:rPr>
+          <w:rFonts w:eastAsia="Times New Roman" w:cs="Times New Roman"/>
+          <w:szCs w:val="24"/>
+        </w:rPr>
+        <w:t xml:space="preserve">: </w:t>
+      </w:r>
+      <w:r>
+        <w:rPr>
+          <w:rFonts w:eastAsia="Times New Roman" w:cs="Times New Roman"/>
+          <w:szCs w:val="24"/>
+        </w:rPr>
+        <w:t>Publicación del sitio web</w:t>
+      </w:r>
+      <w:r>
+        <w:rPr>
+          <w:rFonts w:eastAsia="Times New Roman" w:cs="Times New Roman"/>
+          <w:szCs w:val="24"/>
+        </w:rPr>
+        <w:t>.</w:t>
+      </w:r>
+    </w:p>
+    <w:p>
+      <w:pPr>
+        <w:jc w:val="both"/>
+        <w:rPr>
+          <w:rFonts w:eastAsia="Times New Roman" w:cs="Times New Roman"/>
+          <w:szCs w:val="24"/>
+        </w:rPr>
+      </w:pPr>
+      <w:r>
+        <w:rPr>
+          <w:rFonts w:eastAsia="Times New Roman" w:cs="Times New Roman"/>
+          <w:b/>
+          <w:bCs/>
+          <w:szCs w:val="24"/>
+        </w:rPr>
+        <w:t>Recursos humanos</w:t>
+      </w:r>
+      <w:r>
+        <w:rPr>
+          <w:rFonts w:eastAsia="Times New Roman" w:cs="Times New Roman"/>
+          <w:szCs w:val="24"/>
+        </w:rPr>
+        <w:t>:</w:t>
+      </w:r>
+    </w:p>
+    <w:p>
+      <w:pPr>
+        <w:pStyle w:val="Prrafodelista"/>
+        <w:numPr>
+          <w:ilvl w:val="0"/>
+          <w:numId w:val="29"/>
+        </w:numPr>
+        <w:jc w:val="both"/>
+        <w:rPr>
+          <w:rFonts w:eastAsia="Times New Roman" w:cs="Times New Roman"/>
+          <w:szCs w:val="24"/>
+        </w:rPr>
+      </w:pPr>
+      <w:r>
+        <w:rPr>
+          <w:rFonts w:eastAsia="Times New Roman" w:cs="Times New Roman"/>
+          <w:szCs w:val="24"/>
+        </w:rPr>
+        <w:t>Desarrollador web</w:t>
+      </w:r>
+      <w:r>
+        <w:rPr>
+          <w:rFonts w:eastAsia="Times New Roman" w:cs="Times New Roman"/>
+          <w:szCs w:val="24"/>
+        </w:rPr>
+        <w:t xml:space="preserve">: </w:t>
+      </w:r>
+      <w:r>
+        <w:rPr>
+          <w:rFonts w:eastAsia="Times New Roman" w:cs="Times New Roman"/>
+          <w:szCs w:val="24"/>
+        </w:rPr>
+        <w:t>Programar la página, implementar diseño y funcionalidades básicas.</w:t>
+      </w:r>
+    </w:p>
+    <w:p>
+      <w:pPr>
+        <w:jc w:val="both"/>
+        <w:rPr>
+          <w:rFonts w:eastAsia="Times New Roman" w:cs="Times New Roman"/>
+          <w:szCs w:val="24"/>
+        </w:rPr>
+      </w:pPr>
+    </w:p>
+    <w:p>
+      <w:pPr>
+        <w:jc w:val="both"/>
+        <w:rPr>
+          <w:rFonts w:eastAsia="Times New Roman" w:cs="Times New Roman"/>
+          <w:szCs w:val="24"/>
+        </w:rPr>
+      </w:pPr>
+    </w:p>
+    <w:p>
+      <w:pPr>
+        <w:jc w:val="both"/>
+        <w:rPr>
+          <w:rFonts w:eastAsia="Times New Roman" w:cs="Times New Roman"/>
+          <w:szCs w:val="24"/>
+        </w:rPr>
+      </w:pPr>
     </w:p>
     <w:p>
       <w:pPr>
@@ -2913,6 +3587,7 @@
           <w:szCs w:val="24"/>
           <w:lang w:eastAsia="es-CO"/>
         </w:rPr>
+        <w:lastRenderedPageBreak/>
         <w:t xml:space="preserve">Documentación de la maquetación del diseño web </w:t>
       </w:r>
       <w:r>
@@ -2939,10 +3614,10 @@
           <w:szCs w:val="24"/>
         </w:rPr>
         <w:drawing>
-          <wp:inline distT="0" distB="0" distL="0" distR="0" wp14:anchorId="1D1789E8" wp14:editId="37A3DF27">
-            <wp:extent cx="5612130" cy="3156585"/>
-            <wp:effectExtent l="133350" t="114300" r="140970" b="158115"/>
-            <wp:docPr id="1960940154" name="Imagen 6" descr="Interfaz de usuario gráfica, Aplicación, Mapa&#10;&#10;El contenido generado por IA puede ser incorrecto."/>
+          <wp:inline distT="0" distB="0" distL="0" distR="0" wp14:anchorId="59A82A64" wp14:editId="20611A63">
+            <wp:extent cx="5400000" cy="3037271"/>
+            <wp:effectExtent l="152400" t="152400" r="353695" b="353695"/>
+            <wp:docPr id="1843946413" name="Imagen 1" descr="Interfaz de usuario gráfica&#10;&#10;El contenido generado por IA puede ser incorrecto."/>
             <wp:cNvGraphicFramePr>
               <a:graphicFrameLocks xmlns:a="http://schemas.openxmlformats.org/drawingml/2006/main" noChangeAspect="1"/>
             </wp:cNvGraphicFramePr>
@@ -2950,7 +3625,7 @@
               <a:graphicData uri="http://schemas.openxmlformats.org/drawingml/2006/picture">
                 <pic:pic xmlns:pic="http://schemas.openxmlformats.org/drawingml/2006/picture">
                   <pic:nvPicPr>
-                    <pic:cNvPr id="1960940154" name="Imagen 6" descr="Interfaz de usuario gráfica, Aplicación, Mapa&#10;&#10;El contenido generado por IA puede ser incorrecto."/>
+                    <pic:cNvPr id="1843946413" name="Imagen 1" descr="Interfaz de usuario gráfica&#10;&#10;El contenido generado por IA puede ser incorrecto."/>
                     <pic:cNvPicPr/>
                   </pic:nvPicPr>
                   <pic:blipFill>
@@ -2968,41 +3643,21 @@
                   <pic:spPr>
                     <a:xfrm>
                       <a:off x="0" y="0"/>
-                      <a:ext cx="5612130" cy="3156585"/>
+                      <a:ext cx="5400000" cy="3037271"/>
                     </a:xfrm>
                     <a:prstGeom prst="rect">
                       <a:avLst/>
                     </a:prstGeom>
-                    <a:solidFill>
-                      <a:srgbClr val="FFFFFF">
-                        <a:shade val="85000"/>
-                      </a:srgbClr>
-                    </a:solidFill>
-                    <a:ln w="88900" cap="sq">
-                      <a:solidFill>
-                        <a:srgbClr val="FFFFFF"/>
-                      </a:solidFill>
-                      <a:miter lim="800000"/>
+                    <a:ln>
+                      <a:noFill/>
                     </a:ln>
                     <a:effectLst>
-                      <a:outerShdw blurRad="55000" dist="18000" dir="5400000" algn="tl" rotWithShape="0">
-                        <a:srgbClr val="000000">
-                          <a:alpha val="40000"/>
+                      <a:outerShdw blurRad="292100" dist="139700" dir="2700000" algn="tl" rotWithShape="0">
+                        <a:srgbClr val="333333">
+                          <a:alpha val="65000"/>
                         </a:srgbClr>
                       </a:outerShdw>
                     </a:effectLst>
-                    <a:scene3d>
-                      <a:camera prst="orthographicFront"/>
-                      <a:lightRig rig="twoPt" dir="t">
-                        <a:rot lat="0" lon="0" rev="7200000"/>
-                      </a:lightRig>
-                    </a:scene3d>
-                    <a:sp3d>
-                      <a:bevelT w="25400" h="19050"/>
-                      <a:contourClr>
-                        <a:srgbClr val="FFFFFF"/>
-                      </a:contourClr>
-                    </a:sp3d>
                   </pic:spPr>
                 </pic:pic>
               </a:graphicData>
@@ -3010,27 +3665,17 @@
           </wp:inline>
         </w:drawing>
       </w:r>
-    </w:p>
-    <w:p>
-      <w:pPr>
-        <w:jc w:val="both"/>
-        <w:rPr>
-          <w:rFonts w:eastAsia="Times New Roman" w:cs="Times New Roman"/>
-          <w:szCs w:val="24"/>
-        </w:rPr>
-      </w:pPr>
       <w:r>
         <w:rPr>
           <w:rFonts w:eastAsia="Times New Roman" w:cs="Times New Roman"/>
           <w:noProof/>
           <w:szCs w:val="24"/>
         </w:rPr>
-        <w:lastRenderedPageBreak/>
         <w:drawing>
-          <wp:inline distT="0" distB="0" distL="0" distR="0" wp14:anchorId="38E2B5CF" wp14:editId="7ABBB49B">
-            <wp:extent cx="5612130" cy="3156585"/>
-            <wp:effectExtent l="133350" t="114300" r="140970" b="158115"/>
-            <wp:docPr id="1324249881" name="Imagen 5" descr="Interfaz de usuario gráfica, Aplicación&#10;&#10;El contenido generado por IA puede ser incorrecto."/>
+          <wp:inline distT="0" distB="0" distL="0" distR="0" wp14:anchorId="5E0364AD" wp14:editId="67BEDE40">
+            <wp:extent cx="5400000" cy="3037271"/>
+            <wp:effectExtent l="152400" t="152400" r="353695" b="353695"/>
+            <wp:docPr id="1409480100" name="Imagen 2" descr="Interfaz de usuario gráfica, Aplicación&#10;&#10;El contenido generado por IA puede ser incorrecto."/>
             <wp:cNvGraphicFramePr>
               <a:graphicFrameLocks xmlns:a="http://schemas.openxmlformats.org/drawingml/2006/main" noChangeAspect="1"/>
             </wp:cNvGraphicFramePr>
@@ -3038,7 +3683,7 @@
               <a:graphicData uri="http://schemas.openxmlformats.org/drawingml/2006/picture">
                 <pic:pic xmlns:pic="http://schemas.openxmlformats.org/drawingml/2006/picture">
                   <pic:nvPicPr>
-                    <pic:cNvPr id="1324249881" name="Imagen 5" descr="Interfaz de usuario gráfica, Aplicación&#10;&#10;El contenido generado por IA puede ser incorrecto."/>
+                    <pic:cNvPr id="1409480100" name="Imagen 2" descr="Interfaz de usuario gráfica, Aplicación&#10;&#10;El contenido generado por IA puede ser incorrecto."/>
                     <pic:cNvPicPr/>
                   </pic:nvPicPr>
                   <pic:blipFill>
@@ -3056,41 +3701,21 @@
                   <pic:spPr>
                     <a:xfrm>
                       <a:off x="0" y="0"/>
-                      <a:ext cx="5612130" cy="3156585"/>
+                      <a:ext cx="5400000" cy="3037271"/>
                     </a:xfrm>
                     <a:prstGeom prst="rect">
                       <a:avLst/>
                     </a:prstGeom>
-                    <a:solidFill>
-                      <a:srgbClr val="FFFFFF">
-                        <a:shade val="85000"/>
-                      </a:srgbClr>
-                    </a:solidFill>
-                    <a:ln w="88900" cap="sq">
-                      <a:solidFill>
-                        <a:srgbClr val="FFFFFF"/>
-                      </a:solidFill>
-                      <a:miter lim="800000"/>
+                    <a:ln>
+                      <a:noFill/>
                     </a:ln>
                     <a:effectLst>
-                      <a:outerShdw blurRad="55000" dist="18000" dir="5400000" algn="tl" rotWithShape="0">
-                        <a:srgbClr val="000000">
-                          <a:alpha val="40000"/>
+                      <a:outerShdw blurRad="292100" dist="139700" dir="2700000" algn="tl" rotWithShape="0">
+                        <a:srgbClr val="333333">
+                          <a:alpha val="65000"/>
                         </a:srgbClr>
                       </a:outerShdw>
                     </a:effectLst>
-                    <a:scene3d>
-                      <a:camera prst="orthographicFront"/>
-                      <a:lightRig rig="twoPt" dir="t">
-                        <a:rot lat="0" lon="0" rev="7200000"/>
-                      </a:lightRig>
-                    </a:scene3d>
-                    <a:sp3d>
-                      <a:bevelT w="25400" h="19050"/>
-                      <a:contourClr>
-                        <a:srgbClr val="FFFFFF"/>
-                      </a:contourClr>
-                    </a:sp3d>
                   </pic:spPr>
                 </pic:pic>
               </a:graphicData>
@@ -3104,20 +3729,22 @@
         <w:jc w:val="both"/>
         <w:rPr>
           <w:rFonts w:eastAsia="Times New Roman" w:cs="Times New Roman"/>
-          <w:szCs w:val="24"/>
-        </w:rPr>
-      </w:pPr>
-      <w:r>
-        <w:rPr>
-          <w:rFonts w:eastAsia="Times New Roman" w:cs="Times New Roman"/>
           <w:noProof/>
           <w:szCs w:val="24"/>
         </w:rPr>
+      </w:pPr>
+      <w:r>
+        <w:rPr>
+          <w:rFonts w:eastAsia="Times New Roman" w:cs="Times New Roman"/>
+          <w:noProof/>
+          <w:szCs w:val="24"/>
+        </w:rPr>
+        <w:lastRenderedPageBreak/>
         <w:drawing>
-          <wp:inline distT="0" distB="0" distL="0" distR="0" wp14:anchorId="485839D5" wp14:editId="4DF10CD7">
-            <wp:extent cx="5612130" cy="3156585"/>
-            <wp:effectExtent l="133350" t="114300" r="140970" b="158115"/>
-            <wp:docPr id="2129071672" name="Imagen 4" descr="Interfaz de usuario gráfica, Aplicación, Sitio web&#10;&#10;El contenido generado por IA puede ser incorrecto."/>
+          <wp:inline distT="0" distB="0" distL="0" distR="0" wp14:anchorId="17DEE7A5" wp14:editId="0386DC52">
+            <wp:extent cx="5400000" cy="3037271"/>
+            <wp:effectExtent l="152400" t="152400" r="353695" b="353695"/>
+            <wp:docPr id="786986942" name="Imagen 4" descr="Interfaz de usuario gráfica, Sitio web&#10;&#10;El contenido generado por IA puede ser incorrecto."/>
             <wp:cNvGraphicFramePr>
               <a:graphicFrameLocks xmlns:a="http://schemas.openxmlformats.org/drawingml/2006/main" noChangeAspect="1"/>
             </wp:cNvGraphicFramePr>
@@ -3125,7 +3752,7 @@
               <a:graphicData uri="http://schemas.openxmlformats.org/drawingml/2006/picture">
                 <pic:pic xmlns:pic="http://schemas.openxmlformats.org/drawingml/2006/picture">
                   <pic:nvPicPr>
-                    <pic:cNvPr id="2129071672" name="Imagen 4" descr="Interfaz de usuario gráfica, Aplicación, Sitio web&#10;&#10;El contenido generado por IA puede ser incorrecto."/>
+                    <pic:cNvPr id="786986942" name="Imagen 4" descr="Interfaz de usuario gráfica, Sitio web&#10;&#10;El contenido generado por IA puede ser incorrecto."/>
                     <pic:cNvPicPr/>
                   </pic:nvPicPr>
                   <pic:blipFill>
@@ -3143,41 +3770,21 @@
                   <pic:spPr>
                     <a:xfrm>
                       <a:off x="0" y="0"/>
-                      <a:ext cx="5612130" cy="3156585"/>
+                      <a:ext cx="5400000" cy="3037271"/>
                     </a:xfrm>
                     <a:prstGeom prst="rect">
                       <a:avLst/>
                     </a:prstGeom>
-                    <a:solidFill>
-                      <a:srgbClr val="FFFFFF">
-                        <a:shade val="85000"/>
-                      </a:srgbClr>
-                    </a:solidFill>
-                    <a:ln w="88900" cap="sq">
-                      <a:solidFill>
-                        <a:srgbClr val="FFFFFF"/>
-                      </a:solidFill>
-                      <a:miter lim="800000"/>
+                    <a:ln>
+                      <a:noFill/>
                     </a:ln>
                     <a:effectLst>
-                      <a:outerShdw blurRad="55000" dist="18000" dir="5400000" algn="tl" rotWithShape="0">
-                        <a:srgbClr val="000000">
-                          <a:alpha val="40000"/>
+                      <a:outerShdw blurRad="292100" dist="139700" dir="2700000" algn="tl" rotWithShape="0">
+                        <a:srgbClr val="333333">
+                          <a:alpha val="65000"/>
                         </a:srgbClr>
                       </a:outerShdw>
                     </a:effectLst>
-                    <a:scene3d>
-                      <a:camera prst="orthographicFront"/>
-                      <a:lightRig rig="twoPt" dir="t">
-                        <a:rot lat="0" lon="0" rev="7200000"/>
-                      </a:lightRig>
-                    </a:scene3d>
-                    <a:sp3d>
-                      <a:bevelT w="25400" h="19050"/>
-                      <a:contourClr>
-                        <a:srgbClr val="FFFFFF"/>
-                      </a:contourClr>
-                    </a:sp3d>
                   </pic:spPr>
                 </pic:pic>
               </a:graphicData>
@@ -3185,6 +3792,64 @@
           </wp:inline>
         </w:drawing>
       </w:r>
+      <w:r>
+        <w:rPr>
+          <w:rFonts w:eastAsia="Times New Roman" w:cs="Times New Roman"/>
+          <w:noProof/>
+          <w:szCs w:val="24"/>
+        </w:rPr>
+        <w:drawing>
+          <wp:inline distT="0" distB="0" distL="0" distR="0" wp14:anchorId="7EF92FB7" wp14:editId="53E7ED49">
+            <wp:extent cx="5400000" cy="3037271"/>
+            <wp:effectExtent l="152400" t="152400" r="353695" b="353695"/>
+            <wp:docPr id="299493413" name="Imagen 3" descr="Interfaz de usuario gráfica, Sitio web&#10;&#10;El contenido generado por IA puede ser incorrecto."/>
+            <wp:cNvGraphicFramePr>
+              <a:graphicFrameLocks xmlns:a="http://schemas.openxmlformats.org/drawingml/2006/main" noChangeAspect="1"/>
+            </wp:cNvGraphicFramePr>
+            <a:graphic xmlns:a="http://schemas.openxmlformats.org/drawingml/2006/main">
+              <a:graphicData uri="http://schemas.openxmlformats.org/drawingml/2006/picture">
+                <pic:pic xmlns:pic="http://schemas.openxmlformats.org/drawingml/2006/picture">
+                  <pic:nvPicPr>
+                    <pic:cNvPr id="299493413" name="Imagen 3" descr="Interfaz de usuario gráfica, Sitio web&#10;&#10;El contenido generado por IA puede ser incorrecto."/>
+                    <pic:cNvPicPr/>
+                  </pic:nvPicPr>
+                  <pic:blipFill>
+                    <a:blip r:embed="rId14" cstate="print">
+                      <a:extLst>
+                        <a:ext uri="{28A0092B-C50C-407E-A947-70E740481C1C}">
+                          <a14:useLocalDpi xmlns:a14="http://schemas.microsoft.com/office/drawing/2010/main" val="0"/>
+                        </a:ext>
+                      </a:extLst>
+                    </a:blip>
+                    <a:stretch>
+                      <a:fillRect/>
+                    </a:stretch>
+                  </pic:blipFill>
+                  <pic:spPr>
+                    <a:xfrm>
+                      <a:off x="0" y="0"/>
+                      <a:ext cx="5400000" cy="3037271"/>
+                    </a:xfrm>
+                    <a:prstGeom prst="rect">
+                      <a:avLst/>
+                    </a:prstGeom>
+                    <a:ln>
+                      <a:noFill/>
+                    </a:ln>
+                    <a:effectLst>
+                      <a:outerShdw blurRad="292100" dist="139700" dir="2700000" algn="tl" rotWithShape="0">
+                        <a:srgbClr val="333333">
+                          <a:alpha val="65000"/>
+                        </a:srgbClr>
+                      </a:outerShdw>
+                    </a:effectLst>
+                  </pic:spPr>
+                </pic:pic>
+              </a:graphicData>
+            </a:graphic>
+          </wp:inline>
+        </w:drawing>
+      </w:r>
     </w:p>
     <w:p>
       <w:pPr>
@@ -3194,6 +3859,123 @@
           <w:szCs w:val="24"/>
         </w:rPr>
       </w:pPr>
+      <w:r>
+        <w:rPr>
+          <w:rFonts w:eastAsia="Times New Roman" w:cs="Times New Roman"/>
+          <w:noProof/>
+          <w:szCs w:val="24"/>
+        </w:rPr>
+        <w:lastRenderedPageBreak/>
+        <w:drawing>
+          <wp:inline distT="0" distB="0" distL="0" distR="0" wp14:anchorId="73FF82F1" wp14:editId="261A241B">
+            <wp:extent cx="5400000" cy="3037271"/>
+            <wp:effectExtent l="152400" t="152400" r="353695" b="353695"/>
+            <wp:docPr id="743014343" name="Imagen 5" descr="Interfaz de usuario gráfica&#10;&#10;El contenido generado por IA puede ser incorrecto."/>
+            <wp:cNvGraphicFramePr>
+              <a:graphicFrameLocks xmlns:a="http://schemas.openxmlformats.org/drawingml/2006/main" noChangeAspect="1"/>
+            </wp:cNvGraphicFramePr>
+            <a:graphic xmlns:a="http://schemas.openxmlformats.org/drawingml/2006/main">
+              <a:graphicData uri="http://schemas.openxmlformats.org/drawingml/2006/picture">
+                <pic:pic xmlns:pic="http://schemas.openxmlformats.org/drawingml/2006/picture">
+                  <pic:nvPicPr>
+                    <pic:cNvPr id="743014343" name="Imagen 5" descr="Interfaz de usuario gráfica&#10;&#10;El contenido generado por IA puede ser incorrecto."/>
+                    <pic:cNvPicPr/>
+                  </pic:nvPicPr>
+                  <pic:blipFill>
+                    <a:blip r:embed="rId15" cstate="print">
+                      <a:extLst>
+                        <a:ext uri="{28A0092B-C50C-407E-A947-70E740481C1C}">
+                          <a14:useLocalDpi xmlns:a14="http://schemas.microsoft.com/office/drawing/2010/main" val="0"/>
+                        </a:ext>
+                      </a:extLst>
+                    </a:blip>
+                    <a:stretch>
+                      <a:fillRect/>
+                    </a:stretch>
+                  </pic:blipFill>
+                  <pic:spPr>
+                    <a:xfrm>
+                      <a:off x="0" y="0"/>
+                      <a:ext cx="5400000" cy="3037271"/>
+                    </a:xfrm>
+                    <a:prstGeom prst="rect">
+                      <a:avLst/>
+                    </a:prstGeom>
+                    <a:ln>
+                      <a:noFill/>
+                    </a:ln>
+                    <a:effectLst>
+                      <a:outerShdw blurRad="292100" dist="139700" dir="2700000" algn="tl" rotWithShape="0">
+                        <a:srgbClr val="333333">
+                          <a:alpha val="65000"/>
+                        </a:srgbClr>
+                      </a:outerShdw>
+                    </a:effectLst>
+                  </pic:spPr>
+                </pic:pic>
+              </a:graphicData>
+            </a:graphic>
+          </wp:inline>
+        </w:drawing>
+      </w:r>
+      <w:r>
+        <w:rPr>
+          <w:rFonts w:eastAsia="Times New Roman" w:cs="Times New Roman"/>
+          <w:noProof/>
+          <w:szCs w:val="24"/>
+        </w:rPr>
+        <w:drawing>
+          <wp:inline distT="0" distB="0" distL="0" distR="0" wp14:anchorId="7B904193" wp14:editId="2D6C12CE">
+            <wp:extent cx="5400000" cy="3037271"/>
+            <wp:effectExtent l="152400" t="152400" r="353695" b="353695"/>
+            <wp:docPr id="1464745754" name="Imagen 6" descr="Interfaz de usuario gráfica&#10;&#10;El contenido generado por IA puede ser incorrecto."/>
+            <wp:cNvGraphicFramePr>
+              <a:graphicFrameLocks xmlns:a="http://schemas.openxmlformats.org/drawingml/2006/main" noChangeAspect="1"/>
+            </wp:cNvGraphicFramePr>
+            <a:graphic xmlns:a="http://schemas.openxmlformats.org/drawingml/2006/main">
+              <a:graphicData uri="http://schemas.openxmlformats.org/drawingml/2006/picture">
+                <pic:pic xmlns:pic="http://schemas.openxmlformats.org/drawingml/2006/picture">
+                  <pic:nvPicPr>
+                    <pic:cNvPr id="1464745754" name="Imagen 6" descr="Interfaz de usuario gráfica&#10;&#10;El contenido generado por IA puede ser incorrecto."/>
+                    <pic:cNvPicPr/>
+                  </pic:nvPicPr>
+                  <pic:blipFill>
+                    <a:blip r:embed="rId16" cstate="print">
+                      <a:extLst>
+                        <a:ext uri="{28A0092B-C50C-407E-A947-70E740481C1C}">
+                          <a14:useLocalDpi xmlns:a14="http://schemas.microsoft.com/office/drawing/2010/main" val="0"/>
+                        </a:ext>
+                      </a:extLst>
+                    </a:blip>
+                    <a:stretch>
+                      <a:fillRect/>
+                    </a:stretch>
+                  </pic:blipFill>
+                  <pic:spPr>
+                    <a:xfrm>
+                      <a:off x="0" y="0"/>
+                      <a:ext cx="5400000" cy="3037271"/>
+                    </a:xfrm>
+                    <a:prstGeom prst="rect">
+                      <a:avLst/>
+                    </a:prstGeom>
+                    <a:ln>
+                      <a:noFill/>
+                    </a:ln>
+                    <a:effectLst>
+                      <a:outerShdw blurRad="292100" dist="139700" dir="2700000" algn="tl" rotWithShape="0">
+                        <a:srgbClr val="333333">
+                          <a:alpha val="65000"/>
+                        </a:srgbClr>
+                      </a:outerShdw>
+                    </a:effectLst>
+                  </pic:spPr>
+                </pic:pic>
+              </a:graphicData>
+            </a:graphic>
+          </wp:inline>
+        </w:drawing>
+      </w:r>
     </w:p>
     <w:p>
       <w:pPr>
@@ -3203,13 +3985,15 @@
           <w:szCs w:val="24"/>
         </w:rPr>
       </w:pPr>
-      <w:r>
-        <w:rPr>
-          <w:rFonts w:eastAsia="Times New Roman" w:cs="Times New Roman"/>
-          <w:szCs w:val="24"/>
-        </w:rPr>
-        <w:t>Acá se debe documentar la maquetación del diseño web solución con a la problemática planteada, teniendo en cuanta el análisis de requisitos y las especificaciones técnicas.</w:t>
-      </w:r>
+    </w:p>
+    <w:p>
+      <w:pPr>
+        <w:jc w:val="both"/>
+        <w:rPr>
+          <w:rFonts w:eastAsia="Times New Roman" w:cs="Times New Roman"/>
+          <w:szCs w:val="24"/>
+        </w:rPr>
+      </w:pPr>
     </w:p>
     <w:p>
       <w:pPr>
@@ -3221,37 +4005,6 @@
           <w:lang w:eastAsia="es-CO"/>
         </w:rPr>
       </w:pPr>
-      <w:r>
-        <w:rPr>
-          <w:rFonts w:eastAsia="Times New Roman" w:cs="Segoe UI"/>
-          <w:b/>
-          <w:bCs/>
-          <w:color w:val="FF0000"/>
-          <w:szCs w:val="24"/>
-          <w:lang w:eastAsia="es-CO"/>
-        </w:rPr>
-        <w:lastRenderedPageBreak/>
-        <w:t>¡Advertencia!</w:t>
-      </w:r>
-      <w:r>
-        <w:rPr>
-          <w:rFonts w:eastAsia="Times New Roman" w:cs="Segoe UI"/>
-          <w:b/>
-          <w:bCs/>
-          <w:color w:val="0000FF"/>
-          <w:szCs w:val="24"/>
-          <w:lang w:eastAsia="es-CO"/>
-        </w:rPr>
-        <w:t> Cuando tenga claras las anteriores instrucciones y haya configurado el documento en normas APA 7.0, borre esta información.</w:t>
-      </w:r>
-      <w:r>
-        <w:rPr>
-          <w:rFonts w:cs="Times New Roman"/>
-          <w:b/>
-          <w:szCs w:val="24"/>
-        </w:rPr>
-        <w:br w:type="page"/>
-      </w:r>
     </w:p>
     <w:p>
       <w:pPr>
@@ -3382,17 +4135,6 @@
           <w:color w:val="000000"/>
         </w:rPr>
       </w:pPr>
-    </w:p>
-    <w:p>
-      <w:pPr>
-        <w:pStyle w:val="Pa0"/>
-        <w:spacing w:line="480" w:lineRule="auto"/>
-        <w:ind w:left="709" w:hanging="709"/>
-        <w:rPr>
-          <w:rFonts w:ascii="Verdana" w:hAnsi="Verdana" w:cs="Times New Roman"/>
-          <w:color w:val="000000"/>
-        </w:rPr>
-      </w:pPr>
       <w:r>
         <w:rPr>
           <w:rFonts w:ascii="Verdana" w:hAnsi="Verdana" w:cs="Times New Roman"/>
@@ -3409,7 +4151,7 @@
         </w:rPr>
         <w:t xml:space="preserve">. (s. f.). </w:t>
       </w:r>
-      <w:hyperlink r:id="rId14" w:history="1">
+      <w:hyperlink r:id="rId17" w:history="1">
         <w:r>
           <w:rPr>
             <w:rStyle w:val="Hipervnculo"/>
@@ -3452,7 +4194,7 @@
         </w:rPr>
         <w:t xml:space="preserve">. ES Tutoriales. </w:t>
       </w:r>
-      <w:hyperlink r:id="rId15" w:history="1">
+      <w:hyperlink r:id="rId18" w:history="1">
         <w:r>
           <w:rPr>
             <w:rStyle w:val="Hipervnculo"/>
@@ -3511,7 +4253,7 @@
         </w:rPr>
         <w:t xml:space="preserve"> &amp; Conocimiento. </w:t>
       </w:r>
-      <w:hyperlink r:id="rId16" w:history="1">
+      <w:hyperlink r:id="rId19" w:history="1">
         <w:r>
           <w:rPr>
             <w:rStyle w:val="Hipervnculo"/>
@@ -3565,7 +4307,7 @@
         </w:rPr>
         <w:t xml:space="preserve">. </w:t>
       </w:r>
-      <w:hyperlink r:id="rId17" w:history="1">
+      <w:hyperlink r:id="rId20" w:history="1">
         <w:r>
           <w:rPr>
             <w:rStyle w:val="Hipervnculo"/>
@@ -3577,12 +4319,12 @@
     </w:p>
     <w:p/>
     <w:sectPr>
-      <w:headerReference w:type="even" r:id="rId18"/>
-      <w:headerReference w:type="default" r:id="rId19"/>
-      <w:footerReference w:type="even" r:id="rId20"/>
-      <w:footerReference w:type="default" r:id="rId21"/>
-      <w:headerReference w:type="first" r:id="rId22"/>
-      <w:footerReference w:type="first" r:id="rId23"/>
+      <w:headerReference w:type="even" r:id="rId21"/>
+      <w:headerReference w:type="default" r:id="rId22"/>
+      <w:footerReference w:type="even" r:id="rId23"/>
+      <w:footerReference w:type="default" r:id="rId24"/>
+      <w:headerReference w:type="first" r:id="rId25"/>
+      <w:footerReference w:type="first" r:id="rId26"/>
       <w:pgSz w:w="12240" w:h="15840"/>
       <w:pgMar w:top="1701" w:right="1701" w:bottom="567" w:left="1701" w:header="709" w:footer="709" w:gutter="0"/>
       <w:cols w:space="708"/>
@@ -4084,7 +4826,7 @@
   <w:abstractNum w:abstractNumId="2" w15:restartNumberingAfterBreak="0">
     <w:nsid w:val="129108BF"/>
     <w:multiLevelType w:val="hybridMultilevel"/>
-    <w:tmpl w:val="341EC3E0"/>
+    <w:tmpl w:val="CF56C21C"/>
     <w:lvl w:ilvl="0" w:tplc="240A0001">
       <w:start w:val="1"/>
       <w:numFmt w:val="bullet"/>
@@ -4373,6 +5115,119 @@
     </w:lvl>
   </w:abstractNum>
   <w:abstractNum w:abstractNumId="5" w15:restartNumberingAfterBreak="0">
+    <w:nsid w:val="1EE20E55"/>
+    <w:multiLevelType w:val="hybridMultilevel"/>
+    <w:tmpl w:val="2DB4B49E"/>
+    <w:lvl w:ilvl="0" w:tplc="240A0001">
+      <w:start w:val="1"/>
+      <w:numFmt w:val="bullet"/>
+      <w:lvlText w:val=""/>
+      <w:lvlJc w:val="left"/>
+      <w:pPr>
+        <w:ind w:left="720" w:hanging="360"/>
+      </w:pPr>
+      <w:rPr>
+        <w:rFonts w:ascii="Symbol" w:hAnsi="Symbol" w:hint="default"/>
+      </w:rPr>
+    </w:lvl>
+    <w:lvl w:ilvl="1" w:tplc="240A0003" w:tentative="1">
+      <w:start w:val="1"/>
+      <w:numFmt w:val="bullet"/>
+      <w:lvlText w:val="o"/>
+      <w:lvlJc w:val="left"/>
+      <w:pPr>
+        <w:ind w:left="1440" w:hanging="360"/>
+      </w:pPr>
+      <w:rPr>
+        <w:rFonts w:ascii="Courier New" w:hAnsi="Courier New" w:cs="Courier New" w:hint="default"/>
+      </w:rPr>
+    </w:lvl>
+    <w:lvl w:ilvl="2" w:tplc="240A0005" w:tentative="1">
+      <w:start w:val="1"/>
+      <w:numFmt w:val="bullet"/>
+      <w:lvlText w:val=""/>
+      <w:lvlJc w:val="left"/>
+      <w:pPr>
+        <w:ind w:left="2160" w:hanging="360"/>
+      </w:pPr>
+      <w:rPr>
+        <w:rFonts w:ascii="Wingdings" w:hAnsi="Wingdings" w:hint="default"/>
+      </w:rPr>
+    </w:lvl>
+    <w:lvl w:ilvl="3" w:tplc="240A0001" w:tentative="1">
+      <w:start w:val="1"/>
+      <w:numFmt w:val="bullet"/>
+      <w:lvlText w:val=""/>
+      <w:lvlJc w:val="left"/>
+      <w:pPr>
+        <w:ind w:left="2880" w:hanging="360"/>
+      </w:pPr>
+      <w:rPr>
+        <w:rFonts w:ascii="Symbol" w:hAnsi="Symbol" w:hint="default"/>
+      </w:rPr>
+    </w:lvl>
+    <w:lvl w:ilvl="4" w:tplc="240A0003" w:tentative="1">
+      <w:start w:val="1"/>
+      <w:numFmt w:val="bullet"/>
+      <w:lvlText w:val="o"/>
+      <w:lvlJc w:val="left"/>
+      <w:pPr>
+        <w:ind w:left="3600" w:hanging="360"/>
+      </w:pPr>
+      <w:rPr>
+        <w:rFonts w:ascii="Courier New" w:hAnsi="Courier New" w:cs="Courier New" w:hint="default"/>
+      </w:rPr>
+    </w:lvl>
+    <w:lvl w:ilvl="5" w:tplc="240A0005" w:tentative="1">
+      <w:start w:val="1"/>
+      <w:numFmt w:val="bullet"/>
+      <w:lvlText w:val=""/>
+      <w:lvlJc w:val="left"/>
+      <w:pPr>
+        <w:ind w:left="4320" w:hanging="360"/>
+      </w:pPr>
+      <w:rPr>
+        <w:rFonts w:ascii="Wingdings" w:hAnsi="Wingdings" w:hint="default"/>
+      </w:rPr>
+    </w:lvl>
+    <w:lvl w:ilvl="6" w:tplc="240A0001" w:tentative="1">
+      <w:start w:val="1"/>
+      <w:numFmt w:val="bullet"/>
+      <w:lvlText w:val=""/>
+      <w:lvlJc w:val="left"/>
+      <w:pPr>
+        <w:ind w:left="5040" w:hanging="360"/>
+      </w:pPr>
+      <w:rPr>
+        <w:rFonts w:ascii="Symbol" w:hAnsi="Symbol" w:hint="default"/>
+      </w:rPr>
+    </w:lvl>
+    <w:lvl w:ilvl="7" w:tplc="240A0003" w:tentative="1">
+      <w:start w:val="1"/>
+      <w:numFmt w:val="bullet"/>
+      <w:lvlText w:val="o"/>
+      <w:lvlJc w:val="left"/>
+      <w:pPr>
+        <w:ind w:left="5760" w:hanging="360"/>
+      </w:pPr>
+      <w:rPr>
+        <w:rFonts w:ascii="Courier New" w:hAnsi="Courier New" w:cs="Courier New" w:hint="default"/>
+      </w:rPr>
+    </w:lvl>
+    <w:lvl w:ilvl="8" w:tplc="240A0005" w:tentative="1">
+      <w:start w:val="1"/>
+      <w:numFmt w:val="bullet"/>
+      <w:lvlText w:val=""/>
+      <w:lvlJc w:val="left"/>
+      <w:pPr>
+        <w:ind w:left="6480" w:hanging="360"/>
+      </w:pPr>
+      <w:rPr>
+        <w:rFonts w:ascii="Wingdings" w:hAnsi="Wingdings" w:hint="default"/>
+      </w:rPr>
+    </w:lvl>
+  </w:abstractNum>
+  <w:abstractNum w:abstractNumId="6" w15:restartNumberingAfterBreak="0">
     <w:nsid w:val="2FA20E70"/>
     <w:multiLevelType w:val="hybridMultilevel"/>
     <w:tmpl w:val="85FA681C"/>
@@ -4461,7 +5316,7 @@
       </w:pPr>
     </w:lvl>
   </w:abstractNum>
-  <w:abstractNum w:abstractNumId="6" w15:restartNumberingAfterBreak="0">
+  <w:abstractNum w:abstractNumId="7" w15:restartNumberingAfterBreak="0">
     <w:nsid w:val="386132BB"/>
     <w:multiLevelType w:val="hybridMultilevel"/>
     <w:tmpl w:val="0090D566"/>
@@ -4574,7 +5429,120 @@
       </w:rPr>
     </w:lvl>
   </w:abstractNum>
-  <w:abstractNum w:abstractNumId="7" w15:restartNumberingAfterBreak="0">
+  <w:abstractNum w:abstractNumId="8" w15:restartNumberingAfterBreak="0">
+    <w:nsid w:val="38DA499A"/>
+    <w:multiLevelType w:val="hybridMultilevel"/>
+    <w:tmpl w:val="1388936C"/>
+    <w:lvl w:ilvl="0" w:tplc="240A0001">
+      <w:start w:val="1"/>
+      <w:numFmt w:val="bullet"/>
+      <w:lvlText w:val=""/>
+      <w:lvlJc w:val="left"/>
+      <w:pPr>
+        <w:ind w:left="720" w:hanging="360"/>
+      </w:pPr>
+      <w:rPr>
+        <w:rFonts w:ascii="Symbol" w:hAnsi="Symbol" w:hint="default"/>
+      </w:rPr>
+    </w:lvl>
+    <w:lvl w:ilvl="1" w:tplc="240A0003" w:tentative="1">
+      <w:start w:val="1"/>
+      <w:numFmt w:val="bullet"/>
+      <w:lvlText w:val="o"/>
+      <w:lvlJc w:val="left"/>
+      <w:pPr>
+        <w:ind w:left="1440" w:hanging="360"/>
+      </w:pPr>
+      <w:rPr>
+        <w:rFonts w:ascii="Courier New" w:hAnsi="Courier New" w:cs="Courier New" w:hint="default"/>
+      </w:rPr>
+    </w:lvl>
+    <w:lvl w:ilvl="2" w:tplc="240A0005" w:tentative="1">
+      <w:start w:val="1"/>
+      <w:numFmt w:val="bullet"/>
+      <w:lvlText w:val=""/>
+      <w:lvlJc w:val="left"/>
+      <w:pPr>
+        <w:ind w:left="2160" w:hanging="360"/>
+      </w:pPr>
+      <w:rPr>
+        <w:rFonts w:ascii="Wingdings" w:hAnsi="Wingdings" w:hint="default"/>
+      </w:rPr>
+    </w:lvl>
+    <w:lvl w:ilvl="3" w:tplc="240A0001" w:tentative="1">
+      <w:start w:val="1"/>
+      <w:numFmt w:val="bullet"/>
+      <w:lvlText w:val=""/>
+      <w:lvlJc w:val="left"/>
+      <w:pPr>
+        <w:ind w:left="2880" w:hanging="360"/>
+      </w:pPr>
+      <w:rPr>
+        <w:rFonts w:ascii="Symbol" w:hAnsi="Symbol" w:hint="default"/>
+      </w:rPr>
+    </w:lvl>
+    <w:lvl w:ilvl="4" w:tplc="240A0003" w:tentative="1">
+      <w:start w:val="1"/>
+      <w:numFmt w:val="bullet"/>
+      <w:lvlText w:val="o"/>
+      <w:lvlJc w:val="left"/>
+      <w:pPr>
+        <w:ind w:left="3600" w:hanging="360"/>
+      </w:pPr>
+      <w:rPr>
+        <w:rFonts w:ascii="Courier New" w:hAnsi="Courier New" w:cs="Courier New" w:hint="default"/>
+      </w:rPr>
+    </w:lvl>
+    <w:lvl w:ilvl="5" w:tplc="240A0005" w:tentative="1">
+      <w:start w:val="1"/>
+      <w:numFmt w:val="bullet"/>
+      <w:lvlText w:val=""/>
+      <w:lvlJc w:val="left"/>
+      <w:pPr>
+        <w:ind w:left="4320" w:hanging="360"/>
+      </w:pPr>
+      <w:rPr>
+        <w:rFonts w:ascii="Wingdings" w:hAnsi="Wingdings" w:hint="default"/>
+      </w:rPr>
+    </w:lvl>
+    <w:lvl w:ilvl="6" w:tplc="240A0001" w:tentative="1">
+      <w:start w:val="1"/>
+      <w:numFmt w:val="bullet"/>
+      <w:lvlText w:val=""/>
+      <w:lvlJc w:val="left"/>
+      <w:pPr>
+        <w:ind w:left="5040" w:hanging="360"/>
+      </w:pPr>
+      <w:rPr>
+        <w:rFonts w:ascii="Symbol" w:hAnsi="Symbol" w:hint="default"/>
+      </w:rPr>
+    </w:lvl>
+    <w:lvl w:ilvl="7" w:tplc="240A0003" w:tentative="1">
+      <w:start w:val="1"/>
+      <w:numFmt w:val="bullet"/>
+      <w:lvlText w:val="o"/>
+      <w:lvlJc w:val="left"/>
+      <w:pPr>
+        <w:ind w:left="5760" w:hanging="360"/>
+      </w:pPr>
+      <w:rPr>
+        <w:rFonts w:ascii="Courier New" w:hAnsi="Courier New" w:cs="Courier New" w:hint="default"/>
+      </w:rPr>
+    </w:lvl>
+    <w:lvl w:ilvl="8" w:tplc="240A0005" w:tentative="1">
+      <w:start w:val="1"/>
+      <w:numFmt w:val="bullet"/>
+      <w:lvlText w:val=""/>
+      <w:lvlJc w:val="left"/>
+      <w:pPr>
+        <w:ind w:left="6480" w:hanging="360"/>
+      </w:pPr>
+      <w:rPr>
+        <w:rFonts w:ascii="Wingdings" w:hAnsi="Wingdings" w:hint="default"/>
+      </w:rPr>
+    </w:lvl>
+  </w:abstractNum>
+  <w:abstractNum w:abstractNumId="9" w15:restartNumberingAfterBreak="0">
     <w:nsid w:val="459948E6"/>
     <w:multiLevelType w:val="hybridMultilevel"/>
     <w:tmpl w:val="D9D8C0E4"/>
@@ -4687,7 +5655,7 @@
       </w:rPr>
     </w:lvl>
   </w:abstractNum>
-  <w:abstractNum w:abstractNumId="8" w15:restartNumberingAfterBreak="0">
+  <w:abstractNum w:abstractNumId="10" w15:restartNumberingAfterBreak="0">
     <w:nsid w:val="49742E19"/>
     <w:multiLevelType w:val="hybridMultilevel"/>
     <w:tmpl w:val="17486B3A"/>
@@ -4777,7 +5745,7 @@
       </w:pPr>
     </w:lvl>
   </w:abstractNum>
-  <w:abstractNum w:abstractNumId="9" w15:restartNumberingAfterBreak="0">
+  <w:abstractNum w:abstractNumId="11" w15:restartNumberingAfterBreak="0">
     <w:nsid w:val="49E75FE1"/>
     <w:multiLevelType w:val="hybridMultilevel"/>
     <w:tmpl w:val="17486B3A"/>
@@ -4867,7 +5835,7 @@
       </w:pPr>
     </w:lvl>
   </w:abstractNum>
-  <w:abstractNum w:abstractNumId="10" w15:restartNumberingAfterBreak="0">
+  <w:abstractNum w:abstractNumId="12" w15:restartNumberingAfterBreak="0">
     <w:nsid w:val="519349E8"/>
     <w:multiLevelType w:val="hybridMultilevel"/>
     <w:tmpl w:val="E9B0A3EE"/>
@@ -4956,7 +5924,7 @@
       </w:pPr>
     </w:lvl>
   </w:abstractNum>
-  <w:abstractNum w:abstractNumId="11" w15:restartNumberingAfterBreak="0">
+  <w:abstractNum w:abstractNumId="13" w15:restartNumberingAfterBreak="0">
     <w:nsid w:val="538D192A"/>
     <w:multiLevelType w:val="hybridMultilevel"/>
     <w:tmpl w:val="278EC020"/>
@@ -5042,7 +6010,7 @@
       </w:pPr>
     </w:lvl>
   </w:abstractNum>
-  <w:abstractNum w:abstractNumId="12" w15:restartNumberingAfterBreak="0">
+  <w:abstractNum w:abstractNumId="14" w15:restartNumberingAfterBreak="0">
     <w:nsid w:val="55C53EB3"/>
     <w:multiLevelType w:val="hybridMultilevel"/>
     <w:tmpl w:val="B8C2A1B4"/>
@@ -5155,7 +6123,7 @@
       </w:rPr>
     </w:lvl>
   </w:abstractNum>
-  <w:abstractNum w:abstractNumId="13" w15:restartNumberingAfterBreak="0">
+  <w:abstractNum w:abstractNumId="15" w15:restartNumberingAfterBreak="0">
     <w:nsid w:val="58DE7855"/>
     <w:multiLevelType w:val="hybridMultilevel"/>
     <w:tmpl w:val="3692E944"/>
@@ -5244,7 +6212,7 @@
       </w:pPr>
     </w:lvl>
   </w:abstractNum>
-  <w:abstractNum w:abstractNumId="14" w15:restartNumberingAfterBreak="0">
+  <w:abstractNum w:abstractNumId="16" w15:restartNumberingAfterBreak="0">
     <w:nsid w:val="5D891956"/>
     <w:multiLevelType w:val="hybridMultilevel"/>
     <w:tmpl w:val="62084E0C"/>
@@ -5357,7 +6325,7 @@
       </w:rPr>
     </w:lvl>
   </w:abstractNum>
-  <w:abstractNum w:abstractNumId="15" w15:restartNumberingAfterBreak="0">
+  <w:abstractNum w:abstractNumId="17" w15:restartNumberingAfterBreak="0">
     <w:nsid w:val="655B2148"/>
     <w:multiLevelType w:val="hybridMultilevel"/>
     <w:tmpl w:val="CD7A4A32"/>
@@ -5447,7 +6415,7 @@
       </w:pPr>
     </w:lvl>
   </w:abstractNum>
-  <w:abstractNum w:abstractNumId="16" w15:restartNumberingAfterBreak="0">
+  <w:abstractNum w:abstractNumId="18" w15:restartNumberingAfterBreak="0">
     <w:nsid w:val="65E13B61"/>
     <w:multiLevelType w:val="hybridMultilevel"/>
     <w:tmpl w:val="790E8280"/>
@@ -5533,7 +6501,7 @@
       </w:pPr>
     </w:lvl>
   </w:abstractNum>
-  <w:abstractNum w:abstractNumId="17" w15:restartNumberingAfterBreak="0">
+  <w:abstractNum w:abstractNumId="19" w15:restartNumberingAfterBreak="0">
     <w:nsid w:val="66093213"/>
     <w:multiLevelType w:val="hybridMultilevel"/>
     <w:tmpl w:val="87124A44"/>
@@ -5646,7 +6614,7 @@
       </w:rPr>
     </w:lvl>
   </w:abstractNum>
-  <w:abstractNum w:abstractNumId="18" w15:restartNumberingAfterBreak="0">
+  <w:abstractNum w:abstractNumId="20" w15:restartNumberingAfterBreak="0">
     <w:nsid w:val="68177934"/>
     <w:multiLevelType w:val="hybridMultilevel"/>
     <w:tmpl w:val="FECA4406"/>
@@ -5732,7 +6700,7 @@
       </w:pPr>
     </w:lvl>
   </w:abstractNum>
-  <w:abstractNum w:abstractNumId="19" w15:restartNumberingAfterBreak="0">
+  <w:abstractNum w:abstractNumId="21" w15:restartNumberingAfterBreak="0">
     <w:nsid w:val="6DCD20FA"/>
     <w:multiLevelType w:val="hybridMultilevel"/>
     <w:tmpl w:val="A47C980A"/>
@@ -5845,7 +6813,7 @@
       </w:rPr>
     </w:lvl>
   </w:abstractNum>
-  <w:abstractNum w:abstractNumId="20" w15:restartNumberingAfterBreak="0">
+  <w:abstractNum w:abstractNumId="22" w15:restartNumberingAfterBreak="0">
     <w:nsid w:val="6F816E5D"/>
     <w:multiLevelType w:val="hybridMultilevel"/>
     <w:tmpl w:val="65F86864"/>
@@ -5958,7 +6926,7 @@
       </w:rPr>
     </w:lvl>
   </w:abstractNum>
-  <w:abstractNum w:abstractNumId="21" w15:restartNumberingAfterBreak="0">
+  <w:abstractNum w:abstractNumId="23" w15:restartNumberingAfterBreak="0">
     <w:nsid w:val="77747E3A"/>
     <w:multiLevelType w:val="hybridMultilevel"/>
     <w:tmpl w:val="8DA69BE8"/>
@@ -6071,7 +7039,7 @@
       </w:rPr>
     </w:lvl>
   </w:abstractNum>
-  <w:abstractNum w:abstractNumId="22" w15:restartNumberingAfterBreak="0">
+  <w:abstractNum w:abstractNumId="24" w15:restartNumberingAfterBreak="0">
     <w:nsid w:val="7B2D3C7D"/>
     <w:multiLevelType w:val="hybridMultilevel"/>
     <w:tmpl w:val="705E5B3E"/>
@@ -6184,7 +7152,7 @@
       </w:rPr>
     </w:lvl>
   </w:abstractNum>
-  <w:abstractNum w:abstractNumId="23" w15:restartNumberingAfterBreak="0">
+  <w:abstractNum w:abstractNumId="25" w15:restartNumberingAfterBreak="0">
     <w:nsid w:val="7B9D08C9"/>
     <w:multiLevelType w:val="hybridMultilevel"/>
     <w:tmpl w:val="425044E0"/>
@@ -6297,7 +7265,7 @@
       </w:rPr>
     </w:lvl>
   </w:abstractNum>
-  <w:abstractNum w:abstractNumId="24" w15:restartNumberingAfterBreak="0">
+  <w:abstractNum w:abstractNumId="26" w15:restartNumberingAfterBreak="0">
     <w:nsid w:val="7C372E33"/>
     <w:multiLevelType w:val="multilevel"/>
     <w:tmpl w:val="275415A2"/>
@@ -6383,7 +7351,7 @@
       </w:pPr>
     </w:lvl>
   </w:abstractNum>
-  <w:abstractNum w:abstractNumId="25" w15:restartNumberingAfterBreak="0">
+  <w:abstractNum w:abstractNumId="27" w15:restartNumberingAfterBreak="0">
     <w:nsid w:val="7D9D4AEF"/>
     <w:multiLevelType w:val="hybridMultilevel"/>
     <w:tmpl w:val="D9AC5DB8"/>
@@ -6496,7 +7464,7 @@
       </w:rPr>
     </w:lvl>
   </w:abstractNum>
-  <w:abstractNum w:abstractNumId="26" w15:restartNumberingAfterBreak="0">
+  <w:abstractNum w:abstractNumId="28" w15:restartNumberingAfterBreak="0">
     <w:nsid w:val="7E246E06"/>
     <w:multiLevelType w:val="hybridMultilevel"/>
     <w:tmpl w:val="3118C404"/>
@@ -6616,79 +7584,85 @@
     <w:abstractNumId w:val="0"/>
   </w:num>
   <w:num w:numId="3" w16cid:durableId="772017285">
-    <w:abstractNumId w:val="12"/>
+    <w:abstractNumId w:val="14"/>
   </w:num>
   <w:num w:numId="4" w16cid:durableId="1527018344">
-    <w:abstractNumId w:val="10"/>
+    <w:abstractNumId w:val="12"/>
   </w:num>
   <w:num w:numId="5" w16cid:durableId="69813075">
     <w:abstractNumId w:val="4"/>
   </w:num>
   <w:num w:numId="6" w16cid:durableId="2060737663">
-    <w:abstractNumId w:val="13"/>
+    <w:abstractNumId w:val="15"/>
   </w:num>
   <w:num w:numId="7" w16cid:durableId="242951485">
-    <w:abstractNumId w:val="9"/>
+    <w:abstractNumId w:val="11"/>
   </w:num>
   <w:num w:numId="8" w16cid:durableId="1816875666">
-    <w:abstractNumId w:val="24"/>
+    <w:abstractNumId w:val="26"/>
   </w:num>
   <w:num w:numId="9" w16cid:durableId="912086687">
-    <w:abstractNumId w:val="5"/>
+    <w:abstractNumId w:val="6"/>
   </w:num>
   <w:num w:numId="10" w16cid:durableId="1347094488">
-    <w:abstractNumId w:val="18"/>
+    <w:abstractNumId w:val="20"/>
   </w:num>
   <w:num w:numId="11" w16cid:durableId="609438630">
-    <w:abstractNumId w:val="8"/>
+    <w:abstractNumId w:val="10"/>
   </w:num>
   <w:num w:numId="12" w16cid:durableId="1681659419">
-    <w:abstractNumId w:val="6"/>
+    <w:abstractNumId w:val="7"/>
   </w:num>
   <w:num w:numId="13" w16cid:durableId="1975600476">
+    <w:abstractNumId w:val="19"/>
+  </w:num>
+  <w:num w:numId="14" w16cid:durableId="1685595849">
+    <w:abstractNumId w:val="28"/>
+  </w:num>
+  <w:num w:numId="15" w16cid:durableId="1057318062">
+    <w:abstractNumId w:val="27"/>
+  </w:num>
+  <w:num w:numId="16" w16cid:durableId="1495225790">
+    <w:abstractNumId w:val="16"/>
+  </w:num>
+  <w:num w:numId="17" w16cid:durableId="1207065215">
     <w:abstractNumId w:val="17"/>
   </w:num>
-  <w:num w:numId="14" w16cid:durableId="1685595849">
-    <w:abstractNumId w:val="26"/>
-  </w:num>
-  <w:num w:numId="15" w16cid:durableId="1057318062">
-    <w:abstractNumId w:val="25"/>
-  </w:num>
-  <w:num w:numId="16" w16cid:durableId="1495225790">
-    <w:abstractNumId w:val="14"/>
-  </w:num>
-  <w:num w:numId="17" w16cid:durableId="1207065215">
-    <w:abstractNumId w:val="15"/>
-  </w:num>
   <w:num w:numId="18" w16cid:durableId="722868555">
-    <w:abstractNumId w:val="21"/>
+    <w:abstractNumId w:val="23"/>
   </w:num>
   <w:num w:numId="19" w16cid:durableId="736392799">
     <w:abstractNumId w:val="1"/>
   </w:num>
   <w:num w:numId="20" w16cid:durableId="699549364">
-    <w:abstractNumId w:val="23"/>
+    <w:abstractNumId w:val="25"/>
   </w:num>
   <w:num w:numId="21" w16cid:durableId="1244297858">
     <w:abstractNumId w:val="2"/>
   </w:num>
   <w:num w:numId="22" w16cid:durableId="1223521767">
-    <w:abstractNumId w:val="16"/>
+    <w:abstractNumId w:val="18"/>
   </w:num>
   <w:num w:numId="23" w16cid:durableId="1544635809">
-    <w:abstractNumId w:val="7"/>
+    <w:abstractNumId w:val="9"/>
   </w:num>
   <w:num w:numId="24" w16cid:durableId="1808931142">
-    <w:abstractNumId w:val="11"/>
+    <w:abstractNumId w:val="13"/>
   </w:num>
   <w:num w:numId="25" w16cid:durableId="1707103580">
-    <w:abstractNumId w:val="20"/>
+    <w:abstractNumId w:val="22"/>
   </w:num>
   <w:num w:numId="26" w16cid:durableId="1712804007">
-    <w:abstractNumId w:val="19"/>
+    <w:abstractNumId w:val="21"/>
   </w:num>
   <w:num w:numId="27" w16cid:durableId="1013144931">
-    <w:abstractNumId w:val="22"/>
+    <w:abstractNumId w:val="24"/>
+  </w:num>
+  <w:num w:numId="28" w16cid:durableId="947932399">
+    <w:abstractNumId w:val="8"/>
+  </w:num>
+  <w:num w:numId="29" w16cid:durableId="125318474">
+    <w:abstractNumId w:val="5"/>
   </w:num>
 </w:numbering>
 </file>
@@ -7164,7 +8138,6 @@
   <w:style w:type="character" w:default="1" w:styleId="Fuentedeprrafopredeter">
     <w:name w:val="Default Paragraph Font"/>
     <w:uiPriority w:val="1"/>
-    <w:semiHidden/>
     <w:unhideWhenUsed/>
   </w:style>
   <w:style w:type="table" w:default="1" w:styleId="Tablanormal">
@@ -7814,30 +8787,6 @@
 </file>
 
 <file path=customXml/item1.xml><?xml version="1.0" encoding="utf-8"?>
-<?mso-contentType ?>
-<FormTemplates xmlns="http://schemas.microsoft.com/sharepoint/v3/contenttype/forms">
-  <Display>DocumentLibraryForm</Display>
-  <Edit>DocumentLibraryForm</Edit>
-  <New>DocumentLibraryForm</New>
-</FormTemplates>
-</file>
-
-<file path=customXml/item2.xml><?xml version="1.0" encoding="utf-8"?>
-<b:Sources xmlns:b="http://schemas.openxmlformats.org/officeDocument/2006/bibliography" xmlns="http://schemas.openxmlformats.org/officeDocument/2006/bibliography" SelectedStyle="\APASixthEditionOfficeOnline.xsl" StyleName="APA" Version="6"/>
-</file>
-
-<file path=customXml/item3.xml><?xml version="1.0" encoding="utf-8"?>
-<p:properties xmlns:p="http://schemas.microsoft.com/office/2006/metadata/properties" xmlns:xsi="http://www.w3.org/2001/XMLSchema-instance" xmlns:pc="http://schemas.microsoft.com/office/infopath/2007/PartnerControls">
-  <documentManagement>
-    <TaxCatchAll xmlns="f157a931-c02a-4cc2-8c33-3ee4ce8e004b" xsi:nil="true"/>
-    <lcf76f155ced4ddcb4097134ff3c332f xmlns="9874bfdb-7aa0-40e8-a165-684c4e3872d8">
-      <Terms xmlns="http://schemas.microsoft.com/office/infopath/2007/PartnerControls"/>
-    </lcf76f155ced4ddcb4097134ff3c332f>
-  </documentManagement>
-</p:properties>
-</file>
-
-<file path=customXml/item4.xml><?xml version="1.0" encoding="utf-8"?>
 <ct:contentTypeSchema xmlns:ct="http://schemas.microsoft.com/office/2006/metadata/contentType" xmlns:ma="http://schemas.microsoft.com/office/2006/metadata/properties/metaAttributes" ct:_="" ma:_="" ma:contentTypeName="Documento" ma:contentTypeID="0x01010084B464B1D347F04298FC707333A50E42" ma:contentTypeVersion="14" ma:contentTypeDescription="Crear nuevo documento." ma:contentTypeScope="" ma:versionID="269e7ebf25da21f397728440c9741dec">
   <xsd:schema xmlns:xsd="http://www.w3.org/2001/XMLSchema" xmlns:xs="http://www.w3.org/2001/XMLSchema" xmlns:p="http://schemas.microsoft.com/office/2006/metadata/properties" xmlns:ns2="9874bfdb-7aa0-40e8-a165-684c4e3872d8" xmlns:ns3="f157a931-c02a-4cc2-8c33-3ee4ce8e004b" targetNamespace="http://schemas.microsoft.com/office/2006/metadata/properties" ma:root="true" ma:fieldsID="100d3f0cdd1cfe66f3c450f702f04a39" ns2:_="" ns3:_="">
     <xsd:import namespace="9874bfdb-7aa0-40e8-a165-684c4e3872d8"/>
@@ -8066,34 +9015,31 @@
 </ct:contentTypeSchema>
 </file>
 
-<file path=customXml/itemProps1.xml><?xml version="1.0" encoding="utf-8"?>
-<ds:datastoreItem xmlns:ds="http://schemas.openxmlformats.org/officeDocument/2006/customXml" ds:itemID="{CF5957B4-2219-4F55-9EE3-D4985BDD4816}">
-  <ds:schemaRefs>
-    <ds:schemaRef ds:uri="http://schemas.microsoft.com/sharepoint/v3/contenttype/forms"/>
-  </ds:schemaRefs>
-</ds:datastoreItem>
+<file path=customXml/item2.xml><?xml version="1.0" encoding="utf-8"?>
+<p:properties xmlns:p="http://schemas.microsoft.com/office/2006/metadata/properties" xmlns:xsi="http://www.w3.org/2001/XMLSchema-instance" xmlns:pc="http://schemas.microsoft.com/office/infopath/2007/PartnerControls">
+  <documentManagement>
+    <TaxCatchAll xmlns="f157a931-c02a-4cc2-8c33-3ee4ce8e004b" xsi:nil="true"/>
+    <lcf76f155ced4ddcb4097134ff3c332f xmlns="9874bfdb-7aa0-40e8-a165-684c4e3872d8">
+      <Terms xmlns="http://schemas.microsoft.com/office/infopath/2007/PartnerControls"/>
+    </lcf76f155ced4ddcb4097134ff3c332f>
+  </documentManagement>
+</p:properties>
 </file>
 
-<file path=customXml/itemProps2.xml><?xml version="1.0" encoding="utf-8"?>
-<ds:datastoreItem xmlns:ds="http://schemas.openxmlformats.org/officeDocument/2006/customXml" ds:itemID="{5E645A87-E01E-4F1E-B3E6-A4812183331A}">
-  <ds:schemaRefs>
-    <ds:schemaRef ds:uri="http://schemas.openxmlformats.org/officeDocument/2006/bibliography"/>
-  </ds:schemaRefs>
-</ds:datastoreItem>
+<file path=customXml/item3.xml><?xml version="1.0" encoding="utf-8"?>
+<b:Sources xmlns:b="http://schemas.openxmlformats.org/officeDocument/2006/bibliography" xmlns="http://schemas.openxmlformats.org/officeDocument/2006/bibliography" SelectedStyle="\APASixthEditionOfficeOnline.xsl" StyleName="APA" Version="6"/>
 </file>
 
-<file path=customXml/itemProps3.xml><?xml version="1.0" encoding="utf-8"?>
-<ds:datastoreItem xmlns:ds="http://schemas.openxmlformats.org/officeDocument/2006/customXml" ds:itemID="{75D1C773-847A-4C0C-99B9-7682BBD19801}">
-  <ds:schemaRefs>
-    <ds:schemaRef ds:uri="http://schemas.microsoft.com/office/2006/metadata/properties"/>
-    <ds:schemaRef ds:uri="http://schemas.microsoft.com/office/infopath/2007/PartnerControls"/>
-    <ds:schemaRef ds:uri="f157a931-c02a-4cc2-8c33-3ee4ce8e004b"/>
-    <ds:schemaRef ds:uri="9874bfdb-7aa0-40e8-a165-684c4e3872d8"/>
-  </ds:schemaRefs>
-</ds:datastoreItem>
+<file path=customXml/item4.xml><?xml version="1.0" encoding="utf-8"?>
+<?mso-contentType ?>
+<FormTemplates xmlns="http://schemas.microsoft.com/sharepoint/v3/contenttype/forms">
+  <Display>DocumentLibraryForm</Display>
+  <Edit>DocumentLibraryForm</Edit>
+  <New>DocumentLibraryForm</New>
+</FormTemplates>
 </file>
 
-<file path=customXml/itemProps4.xml><?xml version="1.0" encoding="utf-8"?>
+<file path=customXml/itemProps1.xml><?xml version="1.0" encoding="utf-8"?>
 <ds:datastoreItem xmlns:ds="http://schemas.openxmlformats.org/officeDocument/2006/customXml" ds:itemID="{357189B2-C04A-45B4-BCE2-850544D1EEC3}">
   <ds:schemaRefs>
     <ds:schemaRef ds:uri="http://schemas.microsoft.com/office/2006/metadata/contentType"/>
@@ -8110,4 +9056,31 @@
     <ds:schemaRef ds:uri="http://schemas.microsoft.com/internal/obd"/>
   </ds:schemaRefs>
 </ds:datastoreItem>
+</file>
+
+<file path=customXml/itemProps2.xml><?xml version="1.0" encoding="utf-8"?>
+<ds:datastoreItem xmlns:ds="http://schemas.openxmlformats.org/officeDocument/2006/customXml" ds:itemID="{75D1C773-847A-4C0C-99B9-7682BBD19801}">
+  <ds:schemaRefs>
+    <ds:schemaRef ds:uri="http://schemas.microsoft.com/office/2006/metadata/properties"/>
+    <ds:schemaRef ds:uri="http://schemas.microsoft.com/office/infopath/2007/PartnerControls"/>
+    <ds:schemaRef ds:uri="f157a931-c02a-4cc2-8c33-3ee4ce8e004b"/>
+    <ds:schemaRef ds:uri="9874bfdb-7aa0-40e8-a165-684c4e3872d8"/>
+  </ds:schemaRefs>
+</ds:datastoreItem>
+</file>
+
+<file path=customXml/itemProps3.xml><?xml version="1.0" encoding="utf-8"?>
+<ds:datastoreItem xmlns:ds="http://schemas.openxmlformats.org/officeDocument/2006/customXml" ds:itemID="{5E645A87-E01E-4F1E-B3E6-A4812183331A}">
+  <ds:schemaRefs>
+    <ds:schemaRef ds:uri="http://schemas.openxmlformats.org/officeDocument/2006/bibliography"/>
+  </ds:schemaRefs>
+</ds:datastoreItem>
+</file>
+
+<file path=customXml/itemProps4.xml><?xml version="1.0" encoding="utf-8"?>
+<ds:datastoreItem xmlns:ds="http://schemas.openxmlformats.org/officeDocument/2006/customXml" ds:itemID="{CF5957B4-2219-4F55-9EE3-D4985BDD4816}">
+  <ds:schemaRefs>
+    <ds:schemaRef ds:uri="http://schemas.microsoft.com/sharepoint/v3/contenttype/forms"/>
+  </ds:schemaRefs>
+</ds:datastoreItem>
 </file>
</xml_diff>

<commit_message>
Agregar navegación y mejorar diseño en varias páginas HTML; incluir nuevos vehículos y empresas, y actualizar estilos CSS
</commit_message>
<xml_diff>
--- a/documentacion/Anexo3-German-Romero.docx
+++ b/documentacion/Anexo3-German-Romero.docx
@@ -3979,30 +3979,258 @@
     </w:p>
     <w:p>
       <w:pPr>
+        <w:pStyle w:val="Prrafodelista"/>
+        <w:ind w:left="360"/>
         <w:jc w:val="both"/>
         <w:rPr>
           <w:rFonts w:eastAsia="Times New Roman" w:cs="Times New Roman"/>
-          <w:szCs w:val="24"/>
-        </w:rPr>
-      </w:pPr>
-    </w:p>
-    <w:p>
-      <w:pPr>
+          <w:b/>
+          <w:bCs/>
+          <w:szCs w:val="24"/>
+        </w:rPr>
+      </w:pPr>
+    </w:p>
+    <w:p>
+      <w:pPr>
+        <w:pStyle w:val="Prrafodelista"/>
+        <w:ind w:left="360"/>
         <w:jc w:val="both"/>
         <w:rPr>
           <w:rFonts w:eastAsia="Times New Roman" w:cs="Times New Roman"/>
-          <w:szCs w:val="24"/>
-        </w:rPr>
-      </w:pPr>
-    </w:p>
-    <w:p>
-      <w:pPr>
+          <w:b/>
+          <w:bCs/>
+          <w:szCs w:val="24"/>
+        </w:rPr>
+      </w:pPr>
+    </w:p>
+    <w:p>
+      <w:pPr>
+        <w:pStyle w:val="Prrafodelista"/>
+        <w:ind w:left="360"/>
         <w:jc w:val="both"/>
         <w:rPr>
-          <w:rFonts w:eastAsia="Times New Roman" w:cs="Segoe UI"/>
-          <w:color w:val="212529"/>
+          <w:rFonts w:eastAsia="Times New Roman" w:cs="Times New Roman"/>
+          <w:b/>
+          <w:bCs/>
+          <w:szCs w:val="24"/>
+        </w:rPr>
+      </w:pPr>
+    </w:p>
+    <w:p>
+      <w:pPr>
+        <w:pStyle w:val="Prrafodelista"/>
+        <w:ind w:left="360"/>
+        <w:jc w:val="both"/>
+        <w:rPr>
+          <w:rFonts w:eastAsia="Times New Roman" w:cs="Times New Roman"/>
+          <w:b/>
+          <w:bCs/>
+          <w:szCs w:val="24"/>
+        </w:rPr>
+      </w:pPr>
+    </w:p>
+    <w:p>
+      <w:pPr>
+        <w:pStyle w:val="Prrafodelista"/>
+        <w:numPr>
+          <w:ilvl w:val="0"/>
+          <w:numId w:val="22"/>
+        </w:numPr>
+        <w:jc w:val="both"/>
+        <w:rPr>
+          <w:rFonts w:eastAsia="Times New Roman" w:cs="Times New Roman"/>
+          <w:b/>
+          <w:bCs/>
+          <w:szCs w:val="24"/>
+        </w:rPr>
+      </w:pPr>
+      <w:r>
+        <w:rPr>
+          <w:rFonts w:eastAsia="Times New Roman"/>
+          <w:b/>
+          <w:bCs/>
           <w:szCs w:val="24"/>
           <w:lang w:eastAsia="es-CO"/>
+        </w:rPr>
+        <w:lastRenderedPageBreak/>
+        <w:t>Proyecto web</w:t>
+      </w:r>
+      <w:r>
+        <w:rPr>
+          <w:b/>
+          <w:bCs/>
+          <w:szCs w:val="24"/>
+        </w:rPr>
+        <w:t>:</w:t>
+      </w:r>
+    </w:p>
+    <w:p>
+      <w:pPr>
+        <w:pStyle w:val="Prrafodelista"/>
+        <w:ind w:left="360"/>
+        <w:jc w:val="both"/>
+        <w:rPr>
+          <w:rFonts w:eastAsia="Times New Roman" w:cs="Times New Roman"/>
+          <w:b/>
+          <w:bCs/>
+          <w:szCs w:val="24"/>
+        </w:rPr>
+      </w:pPr>
+    </w:p>
+    <w:p>
+      <w:pPr>
+        <w:pStyle w:val="Prrafodelista"/>
+        <w:numPr>
+          <w:ilvl w:val="1"/>
+          <w:numId w:val="22"/>
+        </w:numPr>
+        <w:jc w:val="both"/>
+        <w:rPr>
+          <w:rFonts w:eastAsia="Times New Roman" w:cs="Times New Roman"/>
+          <w:b/>
+          <w:bCs/>
+          <w:szCs w:val="24"/>
+        </w:rPr>
+      </w:pPr>
+      <w:r>
+        <w:rPr>
+          <w:rFonts w:eastAsia="Times New Roman" w:cs="Times New Roman"/>
+          <w:szCs w:val="24"/>
+        </w:rPr>
+        <w:t>GitHub Page</w:t>
+      </w:r>
+      <w:r>
+        <w:rPr>
+          <w:rFonts w:eastAsia="Times New Roman" w:cs="Times New Roman"/>
+          <w:szCs w:val="24"/>
+        </w:rPr>
+        <w:t>:</w:t>
+      </w:r>
+    </w:p>
+    <w:p>
+      <w:pPr>
+        <w:ind w:left="360"/>
+        <w:jc w:val="both"/>
+        <w:rPr>
+          <w:rFonts w:eastAsia="Times New Roman" w:cs="Times New Roman"/>
+          <w:b/>
+          <w:bCs/>
+          <w:szCs w:val="24"/>
+        </w:rPr>
+      </w:pPr>
+    </w:p>
+    <w:p>
+      <w:pPr>
+        <w:pStyle w:val="Prrafodelista"/>
+        <w:numPr>
+          <w:ilvl w:val="0"/>
+          <w:numId w:val="29"/>
+        </w:numPr>
+        <w:jc w:val="both"/>
+        <w:rPr>
+          <w:rFonts w:eastAsia="Times New Roman" w:cs="Times New Roman"/>
+          <w:szCs w:val="24"/>
+        </w:rPr>
+      </w:pPr>
+      <w:r>
+        <w:rPr>
+          <w:rFonts w:eastAsia="Times New Roman" w:cs="Times New Roman"/>
+          <w:szCs w:val="24"/>
+        </w:rPr>
+        <w:t>One Drive</w:t>
+      </w:r>
+      <w:r>
+        <w:rPr>
+          <w:rFonts w:eastAsia="Times New Roman" w:cs="Times New Roman"/>
+          <w:szCs w:val="24"/>
+        </w:rPr>
+        <w:t>:</w:t>
+      </w:r>
+    </w:p>
+    <w:p>
+      <w:pPr>
+        <w:ind w:left="360"/>
+        <w:jc w:val="both"/>
+        <w:rPr>
+          <w:rFonts w:eastAsia="Times New Roman" w:cs="Times New Roman"/>
+          <w:szCs w:val="24"/>
+        </w:rPr>
+      </w:pPr>
+      <w:hyperlink r:id="rId17" w:history="1">
+        <w:r>
+          <w:rPr>
+            <w:rStyle w:val="Hipervnculo"/>
+            <w:rFonts w:eastAsia="Times New Roman" w:cs="Times New Roman"/>
+            <w:szCs w:val="24"/>
+          </w:rPr>
+          <w:t>https://1drv.ms/f/c/c084a2e4f890df24/ElI62q8b_89Enp0J8n0KJroBRMViTdh0ZjlNaxk3o7Kplg?e=bt</w:t>
+        </w:r>
+        <w:r>
+          <w:rPr>
+            <w:rStyle w:val="Hipervnculo"/>
+            <w:rFonts w:eastAsia="Times New Roman" w:cs="Times New Roman"/>
+            <w:szCs w:val="24"/>
+          </w:rPr>
+          <w:t>7</w:t>
+        </w:r>
+        <w:r>
+          <w:rPr>
+            <w:rStyle w:val="Hipervnculo"/>
+            <w:rFonts w:eastAsia="Times New Roman" w:cs="Times New Roman"/>
+            <w:szCs w:val="24"/>
+          </w:rPr>
+          <w:t>4le</w:t>
+        </w:r>
+      </w:hyperlink>
+    </w:p>
+    <w:p>
+      <w:pPr>
+        <w:pStyle w:val="Prrafodelista"/>
+        <w:numPr>
+          <w:ilvl w:val="0"/>
+          <w:numId w:val="29"/>
+        </w:numPr>
+        <w:jc w:val="both"/>
+        <w:rPr>
+          <w:rFonts w:eastAsia="Times New Roman" w:cs="Times New Roman"/>
+          <w:szCs w:val="24"/>
+        </w:rPr>
+      </w:pPr>
+      <w:r>
+        <w:rPr>
+          <w:rFonts w:eastAsia="Times New Roman" w:cs="Times New Roman"/>
+          <w:szCs w:val="24"/>
+        </w:rPr>
+        <w:t>GitHub:</w:t>
+      </w:r>
+    </w:p>
+    <w:p>
+      <w:pPr>
+        <w:ind w:left="360"/>
+        <w:jc w:val="both"/>
+        <w:rPr>
+          <w:rFonts w:eastAsia="Times New Roman" w:cs="Times New Roman"/>
+          <w:szCs w:val="24"/>
+        </w:rPr>
+      </w:pPr>
+      <w:hyperlink r:id="rId18" w:history="1">
+        <w:r>
+          <w:rPr>
+            <w:rStyle w:val="Hipervnculo"/>
+            <w:rFonts w:eastAsia="Times New Roman" w:cs="Times New Roman"/>
+            <w:szCs w:val="24"/>
+          </w:rPr>
+          <w:t>https://github.com/germanrole98/terminal-transporte</w:t>
+        </w:r>
+      </w:hyperlink>
+    </w:p>
+    <w:p>
+      <w:pPr>
+        <w:ind w:left="360"/>
+        <w:jc w:val="both"/>
+        <w:rPr>
+          <w:rFonts w:eastAsia="Times New Roman" w:cs="Times New Roman"/>
+          <w:szCs w:val="24"/>
         </w:rPr>
       </w:pPr>
     </w:p>
@@ -4024,7 +4252,6 @@
           <w:b/>
           <w:szCs w:val="24"/>
         </w:rPr>
-        <w:lastRenderedPageBreak/>
         <w:t>Conclusiones</w:t>
       </w:r>
     </w:p>
@@ -4151,7 +4378,7 @@
         </w:rPr>
         <w:t xml:space="preserve">. (s. f.). </w:t>
       </w:r>
-      <w:hyperlink r:id="rId17" w:history="1">
+      <w:hyperlink r:id="rId19" w:history="1">
         <w:r>
           <w:rPr>
             <w:rStyle w:val="Hipervnculo"/>
@@ -4194,7 +4421,7 @@
         </w:rPr>
         <w:t xml:space="preserve">. ES Tutoriales. </w:t>
       </w:r>
-      <w:hyperlink r:id="rId18" w:history="1">
+      <w:hyperlink r:id="rId20" w:history="1">
         <w:r>
           <w:rPr>
             <w:rStyle w:val="Hipervnculo"/>
@@ -4253,7 +4480,7 @@
         </w:rPr>
         <w:t xml:space="preserve"> &amp; Conocimiento. </w:t>
       </w:r>
-      <w:hyperlink r:id="rId19" w:history="1">
+      <w:hyperlink r:id="rId21" w:history="1">
         <w:r>
           <w:rPr>
             <w:rStyle w:val="Hipervnculo"/>
@@ -4307,7 +4534,7 @@
         </w:rPr>
         <w:t xml:space="preserve">. </w:t>
       </w:r>
-      <w:hyperlink r:id="rId20" w:history="1">
+      <w:hyperlink r:id="rId22" w:history="1">
         <w:r>
           <w:rPr>
             <w:rStyle w:val="Hipervnculo"/>
@@ -4319,12 +4546,12 @@
     </w:p>
     <w:p/>
     <w:sectPr>
-      <w:headerReference w:type="even" r:id="rId21"/>
-      <w:headerReference w:type="default" r:id="rId22"/>
-      <w:footerReference w:type="even" r:id="rId23"/>
-      <w:footerReference w:type="default" r:id="rId24"/>
-      <w:headerReference w:type="first" r:id="rId25"/>
-      <w:footerReference w:type="first" r:id="rId26"/>
+      <w:headerReference w:type="even" r:id="rId23"/>
+      <w:headerReference w:type="default" r:id="rId24"/>
+      <w:footerReference w:type="even" r:id="rId25"/>
+      <w:footerReference w:type="default" r:id="rId26"/>
+      <w:headerReference w:type="first" r:id="rId27"/>
+      <w:footerReference w:type="first" r:id="rId28"/>
       <w:pgSz w:w="12240" w:h="15840"/>
       <w:pgMar w:top="1701" w:right="1701" w:bottom="567" w:left="1701" w:header="709" w:footer="709" w:gutter="0"/>
       <w:cols w:space="708"/>
@@ -5117,7 +5344,7 @@
   <w:abstractNum w:abstractNumId="5" w15:restartNumberingAfterBreak="0">
     <w:nsid w:val="1EE20E55"/>
     <w:multiLevelType w:val="hybridMultilevel"/>
-    <w:tmpl w:val="2DB4B49E"/>
+    <w:tmpl w:val="198C6F24"/>
     <w:lvl w:ilvl="0" w:tplc="240A0001">
       <w:start w:val="1"/>
       <w:numFmt w:val="bullet"/>
@@ -6418,7 +6645,7 @@
   <w:abstractNum w:abstractNumId="18" w15:restartNumberingAfterBreak="0">
     <w:nsid w:val="65E13B61"/>
     <w:multiLevelType w:val="hybridMultilevel"/>
-    <w:tmpl w:val="790E8280"/>
+    <w:tmpl w:val="97808354"/>
     <w:lvl w:ilvl="0" w:tplc="240A000F">
       <w:start w:val="1"/>
       <w:numFmt w:val="decimal"/>
@@ -6428,14 +6655,17 @@
         <w:ind w:left="360" w:hanging="360"/>
       </w:pPr>
     </w:lvl>
-    <w:lvl w:ilvl="1" w:tplc="240A0019" w:tentative="1">
-      <w:start w:val="1"/>
-      <w:numFmt w:val="lowerLetter"/>
-      <w:lvlText w:val="%2."/>
-      <w:lvlJc w:val="left"/>
-      <w:pPr>
-        <w:ind w:left="1080" w:hanging="360"/>
-      </w:pPr>
+    <w:lvl w:ilvl="1" w:tplc="240A0001">
+      <w:start w:val="1"/>
+      <w:numFmt w:val="bullet"/>
+      <w:lvlText w:val=""/>
+      <w:lvlJc w:val="left"/>
+      <w:pPr>
+        <w:ind w:left="720" w:hanging="360"/>
+      </w:pPr>
+      <w:rPr>
+        <w:rFonts w:ascii="Symbol" w:hAnsi="Symbol" w:hint="default"/>
+      </w:rPr>
     </w:lvl>
     <w:lvl w:ilvl="2" w:tplc="240A001B" w:tentative="1">
       <w:start w:val="1"/>

</xml_diff>

<commit_message>
Actualizar la introducción y los objetivos del proyecto web para mejorar la claridad y enfoque en la solución de problemas de información en terminales de transporte.
</commit_message>
<xml_diff>
--- a/documentacion/Anexo3-German-Romero.docx
+++ b/documentacion/Anexo3-German-Romero.docx
@@ -565,17 +565,40 @@
           <w:rFonts w:cs="Times New Roman"/>
           <w:szCs w:val="24"/>
         </w:rPr>
-        <w:t>La introducción debe resumir los aspectos y objetivos del trabajo y presentarse de manera atractiva para despertar el interés del lector.</w:t>
+        <w:t xml:space="preserve">Este proyecto busca solucionar un problema común </w:t>
+      </w:r>
+      <w:r>
+        <w:rPr>
+          <w:rFonts w:cs="Times New Roman"/>
+          <w:szCs w:val="24"/>
+        </w:rPr>
+        <w:t>que afrontan las terminales de transporte</w:t>
+      </w:r>
+      <w:r>
+        <w:rPr>
+          <w:rFonts w:cs="Times New Roman"/>
+          <w:szCs w:val="24"/>
+        </w:rPr>
+        <w:t>: la falta de una forma fácil de que los usuarios se informen sobre los servicios.</w:t>
       </w:r>
     </w:p>
     <w:p>
       <w:pPr>
         <w:jc w:val="both"/>
         <w:rPr>
+          <w:rFonts w:eastAsia="Times New Roman" w:cs="Segoe UI"/>
+          <w:color w:val="212529"/>
+          <w:szCs w:val="24"/>
+          <w:lang w:eastAsia="es-CO"/>
+        </w:rPr>
+      </w:pPr>
+      <w:r>
+        <w:rPr>
           <w:rFonts w:cs="Times New Roman"/>
           <w:szCs w:val="24"/>
         </w:rPr>
-      </w:pPr>
+        <w:t>Para arreglar esto, vamos a crear una página web estática, que muestra información clara sobre la terminal. Así, los usuarios podrán ver desde su celular u ordenador los horarios, empresas y costos de manera rápida y sin complicaciones, usando las tecnologías de la información que ya conocemos.</w:t>
+      </w:r>
     </w:p>
     <w:p>
       <w:pPr>
@@ -585,19 +608,11 @@
           <w:szCs w:val="24"/>
         </w:rPr>
       </w:pPr>
-      <w:r>
-        <w:rPr>
-          <w:rFonts w:cs="Times New Roman"/>
-          <w:szCs w:val="24"/>
-        </w:rPr>
-        <w:t>La introducción de un texto es el primer contacto que el lector tiene con el tema que se va a abordar. El contenido expresado debe ser atrapante, reflexivo y veraz, para invitar a la lectura. La introducción de cualquier trabajo académico nos permite mostrar las ideas y los temas que vamos a tratar de manera concisa y clara, mencionando en breves palabras los objetivos del trabajo y la metodología que utilizamos para realizarlo.</w:t>
-      </w:r>
     </w:p>
     <w:p>
       <w:pPr>
         <w:jc w:val="both"/>
         <w:rPr>
-          <w:rFonts w:cs="Times New Roman"/>
           <w:szCs w:val="24"/>
         </w:rPr>
       </w:pPr>
@@ -606,16 +621,113 @@
       <w:pPr>
         <w:jc w:val="both"/>
         <w:rPr>
-          <w:rFonts w:cs="Times New Roman"/>
-          <w:szCs w:val="24"/>
-        </w:rPr>
-      </w:pPr>
-      <w:r>
-        <w:rPr>
-          <w:rFonts w:cs="Times New Roman"/>
-          <w:szCs w:val="24"/>
-        </w:rPr>
-        <w:t>Para elaborar una introducción adecuada, debemos hacernos las siguientes preguntas:</w:t>
+          <w:szCs w:val="24"/>
+        </w:rPr>
+      </w:pPr>
+    </w:p>
+    <w:p>
+      <w:pPr>
+        <w:jc w:val="both"/>
+        <w:rPr>
+          <w:szCs w:val="24"/>
+        </w:rPr>
+      </w:pPr>
+    </w:p>
+    <w:p>
+      <w:pPr>
+        <w:jc w:val="both"/>
+        <w:rPr>
+          <w:szCs w:val="24"/>
+        </w:rPr>
+      </w:pPr>
+    </w:p>
+    <w:p>
+      <w:pPr>
+        <w:jc w:val="both"/>
+        <w:rPr>
+          <w:szCs w:val="24"/>
+        </w:rPr>
+      </w:pPr>
+    </w:p>
+    <w:p>
+      <w:pPr>
+        <w:jc w:val="center"/>
+        <w:rPr>
+          <w:b/>
+          <w:szCs w:val="24"/>
+        </w:rPr>
+      </w:pPr>
+      <w:r>
+        <w:rPr>
+          <w:szCs w:val="24"/>
+        </w:rPr>
+        <w:br w:type="page"/>
+      </w:r>
+      <w:r>
+        <w:rPr>
+          <w:b/>
+          <w:szCs w:val="24"/>
+        </w:rPr>
+        <w:lastRenderedPageBreak/>
+        <w:t>Objetivos</w:t>
+      </w:r>
+    </w:p>
+    <w:p>
+      <w:pPr>
+        <w:jc w:val="both"/>
+        <w:rPr>
+          <w:szCs w:val="24"/>
+        </w:rPr>
+      </w:pPr>
+    </w:p>
+    <w:p>
+      <w:pPr>
+        <w:jc w:val="both"/>
+        <w:rPr>
+          <w:b/>
+          <w:bCs/>
+          <w:szCs w:val="24"/>
+        </w:rPr>
+      </w:pPr>
+      <w:r>
+        <w:rPr>
+          <w:b/>
+          <w:bCs/>
+          <w:szCs w:val="24"/>
+        </w:rPr>
+        <w:t xml:space="preserve">General </w:t>
+      </w:r>
+    </w:p>
+    <w:p>
+      <w:pPr>
+        <w:jc w:val="both"/>
+        <w:rPr>
+          <w:szCs w:val="24"/>
+        </w:rPr>
+      </w:pPr>
+      <w:r>
+        <w:rPr>
+          <w:szCs w:val="24"/>
+        </w:rPr>
+        <w:t>Crear una página web simple y funcional para la terminal de transporte. Esta web permitirá a los usuarios consultar información esencial como horarios, rutas y costos, mejorando su experiencia y facilitando la comunicación.</w:t>
+      </w:r>
+    </w:p>
+    <w:p>
+      <w:pPr>
+        <w:jc w:val="both"/>
+        <w:rPr>
+          <w:b/>
+          <w:bCs/>
+          <w:szCs w:val="24"/>
+        </w:rPr>
+      </w:pPr>
+      <w:r>
+        <w:rPr>
+          <w:b/>
+          <w:bCs/>
+          <w:szCs w:val="24"/>
+        </w:rPr>
+        <w:t>Específicos</w:t>
       </w:r>
     </w:p>
     <w:p>
@@ -623,21 +735,36 @@
         <w:pStyle w:val="Prrafodelista"/>
         <w:numPr>
           <w:ilvl w:val="0"/>
-          <w:numId w:val="16"/>
+          <w:numId w:val="31"/>
         </w:numPr>
-        <w:spacing w:after="0" w:line="240" w:lineRule="auto"/>
         <w:jc w:val="both"/>
         <w:rPr>
-          <w:rFonts w:cs="Times New Roman"/>
-          <w:szCs w:val="24"/>
-        </w:rPr>
-      </w:pPr>
-      <w:r>
-        <w:rPr>
-          <w:rFonts w:cs="Times New Roman"/>
-          <w:szCs w:val="24"/>
-        </w:rPr>
-        <w:t>¿Cuál es el tema?</w:t>
+          <w:szCs w:val="24"/>
+        </w:rPr>
+      </w:pPr>
+      <w:r>
+        <w:rPr>
+          <w:szCs w:val="24"/>
+        </w:rPr>
+        <w:t>Estructurar</w:t>
+      </w:r>
+      <w:r>
+        <w:rPr>
+          <w:szCs w:val="24"/>
+        </w:rPr>
+        <w:t xml:space="preserve"> cómo se verá la página para que sea fácil de usa</w:t>
+      </w:r>
+      <w:r>
+        <w:rPr>
+          <w:szCs w:val="24"/>
+        </w:rPr>
+        <w:t>r</w:t>
+      </w:r>
+      <w:r>
+        <w:rPr>
+          <w:szCs w:val="24"/>
+        </w:rPr>
+        <w:t>.</w:t>
       </w:r>
     </w:p>
     <w:p>
@@ -645,21 +772,18 @@
         <w:pStyle w:val="Prrafodelista"/>
         <w:numPr>
           <w:ilvl w:val="0"/>
-          <w:numId w:val="16"/>
+          <w:numId w:val="31"/>
         </w:numPr>
-        <w:spacing w:after="0" w:line="240" w:lineRule="auto"/>
         <w:jc w:val="both"/>
         <w:rPr>
-          <w:rFonts w:cs="Times New Roman"/>
-          <w:szCs w:val="24"/>
-        </w:rPr>
-      </w:pPr>
-      <w:r>
-        <w:rPr>
-          <w:rFonts w:cs="Times New Roman"/>
-          <w:szCs w:val="24"/>
-        </w:rPr>
-        <w:t>¿Por qué elaboramos este trabajo?</w:t>
+          <w:szCs w:val="24"/>
+        </w:rPr>
+      </w:pPr>
+      <w:r>
+        <w:rPr>
+          <w:szCs w:val="24"/>
+        </w:rPr>
+        <w:t>Usar HTML, CSS y JavaScript para dar vida al diseño, haciendo que la página muestre la información de forma clara y con algunas funciones básicas, como el cálculo de costos.</w:t>
       </w:r>
     </w:p>
     <w:p>
@@ -667,335 +791,19 @@
         <w:pStyle w:val="Prrafodelista"/>
         <w:numPr>
           <w:ilvl w:val="0"/>
-          <w:numId w:val="16"/>
+          <w:numId w:val="31"/>
         </w:numPr>
-        <w:spacing w:after="0" w:line="240" w:lineRule="auto"/>
         <w:jc w:val="both"/>
         <w:rPr>
-          <w:rFonts w:cs="Times New Roman"/>
-          <w:szCs w:val="24"/>
-        </w:rPr>
-      </w:pPr>
-      <w:r>
-        <w:rPr>
-          <w:rFonts w:cs="Times New Roman"/>
-          <w:szCs w:val="24"/>
-        </w:rPr>
-        <w:t>¿Qué métodos fueron utilizados?</w:t>
-      </w:r>
-    </w:p>
-    <w:p>
-      <w:pPr>
-        <w:pStyle w:val="Prrafodelista"/>
-        <w:numPr>
-          <w:ilvl w:val="0"/>
-          <w:numId w:val="16"/>
-        </w:numPr>
-        <w:spacing w:after="0" w:line="240" w:lineRule="auto"/>
-        <w:jc w:val="both"/>
-        <w:rPr>
-          <w:rFonts w:cs="Times New Roman"/>
-          <w:szCs w:val="24"/>
-        </w:rPr>
-      </w:pPr>
-      <w:r>
-        <w:rPr>
-          <w:rFonts w:cs="Times New Roman"/>
-          <w:szCs w:val="24"/>
-        </w:rPr>
-        <w:t>¿Cuáles son sus limitaciones?</w:t>
-      </w:r>
-    </w:p>
-    <w:p>
-      <w:pPr>
-        <w:jc w:val="both"/>
-        <w:rPr>
-          <w:rFonts w:cs="Times New Roman"/>
-          <w:szCs w:val="24"/>
-        </w:rPr>
-      </w:pPr>
-    </w:p>
-    <w:p>
-      <w:pPr>
-        <w:jc w:val="both"/>
-        <w:rPr>
-          <w:rFonts w:cs="Times New Roman"/>
-          <w:szCs w:val="24"/>
-        </w:rPr>
-      </w:pPr>
-      <w:r>
-        <w:rPr>
-          <w:rFonts w:cs="Times New Roman"/>
-          <w:szCs w:val="24"/>
-        </w:rPr>
-        <w:t xml:space="preserve">Estas preguntas no tienen por qué responderse explícitamente, sino que deben servir como guía para saber qué </w:t>
-      </w:r>
-      <w:proofErr w:type="gramStart"/>
-      <w:r>
-        <w:rPr>
-          <w:rFonts w:cs="Times New Roman"/>
-          <w:szCs w:val="24"/>
-        </w:rPr>
-        <w:t>tiene que tener</w:t>
-      </w:r>
-      <w:proofErr w:type="gramEnd"/>
-      <w:r>
-        <w:rPr>
-          <w:rFonts w:cs="Times New Roman"/>
-          <w:szCs w:val="24"/>
-        </w:rPr>
-        <w:t xml:space="preserve"> nuestra introducción. El lector, al momento de comenzar su lectura, se preguntará por estas cuestiones. Por otra parte, el enfoque de la introducción puede ser muy diverso y depende del tema que se trata en el trabajo y las limitaciones que presente.</w:t>
-      </w:r>
-    </w:p>
-    <w:p>
-      <w:pPr>
-        <w:shd w:val="clear" w:color="auto" w:fill="FFFFFF"/>
-        <w:spacing w:after="100" w:afterAutospacing="1" w:line="240" w:lineRule="auto"/>
-        <w:rPr>
-          <w:rFonts w:eastAsia="Times New Roman" w:cs="Segoe UI"/>
-          <w:color w:val="212529"/>
-          <w:szCs w:val="24"/>
-          <w:lang w:eastAsia="es-CO"/>
-        </w:rPr>
-      </w:pPr>
-      <w:r>
-        <w:rPr>
-          <w:rFonts w:eastAsia="Times New Roman" w:cs="Segoe UI"/>
-          <w:b/>
-          <w:bCs/>
-          <w:color w:val="FF0000"/>
-          <w:szCs w:val="24"/>
-          <w:lang w:eastAsia="es-CO"/>
-        </w:rPr>
-        <w:t>¡Advertencia!</w:t>
-      </w:r>
-      <w:r>
-        <w:rPr>
-          <w:rFonts w:eastAsia="Times New Roman" w:cs="Segoe UI"/>
-          <w:b/>
-          <w:bCs/>
-          <w:color w:val="0000FF"/>
-          <w:szCs w:val="24"/>
-          <w:lang w:eastAsia="es-CO"/>
-        </w:rPr>
-        <w:t> Cuando tenga claras las anteriores instrucciones y haya configurado las normas, borre esta información y elabore la introducción para el desarrollo de la actividad.</w:t>
-      </w:r>
-    </w:p>
-    <w:p>
-      <w:pPr>
-        <w:jc w:val="both"/>
-        <w:rPr>
-          <w:rFonts w:cs="Times New Roman"/>
-          <w:szCs w:val="24"/>
-        </w:rPr>
-      </w:pPr>
-    </w:p>
-    <w:p>
-      <w:pPr>
-        <w:jc w:val="both"/>
-        <w:rPr>
-          <w:szCs w:val="24"/>
-        </w:rPr>
-      </w:pPr>
-    </w:p>
-    <w:p>
-      <w:pPr>
-        <w:jc w:val="both"/>
-        <w:rPr>
-          <w:szCs w:val="24"/>
-        </w:rPr>
-      </w:pPr>
-    </w:p>
-    <w:p>
-      <w:pPr>
-        <w:jc w:val="both"/>
-        <w:rPr>
-          <w:szCs w:val="24"/>
-        </w:rPr>
-      </w:pPr>
-    </w:p>
-    <w:p>
-      <w:pPr>
-        <w:jc w:val="both"/>
-        <w:rPr>
-          <w:szCs w:val="24"/>
-        </w:rPr>
-      </w:pPr>
-    </w:p>
-    <w:p>
-      <w:pPr>
-        <w:jc w:val="both"/>
-        <w:rPr>
-          <w:szCs w:val="24"/>
-        </w:rPr>
-      </w:pPr>
-    </w:p>
-    <w:p>
-      <w:pPr>
-        <w:jc w:val="center"/>
-        <w:rPr>
-          <w:b/>
-          <w:szCs w:val="24"/>
-        </w:rPr>
-      </w:pPr>
-      <w:r>
-        <w:rPr>
-          <w:szCs w:val="24"/>
-        </w:rPr>
-        <w:br w:type="page"/>
-      </w:r>
-      <w:r>
-        <w:rPr>
-          <w:b/>
-          <w:szCs w:val="24"/>
-        </w:rPr>
-        <w:lastRenderedPageBreak/>
-        <w:t>Objetivos</w:t>
-      </w:r>
-    </w:p>
-    <w:p>
-      <w:pPr>
-        <w:jc w:val="both"/>
-        <w:rPr>
-          <w:szCs w:val="24"/>
-        </w:rPr>
-      </w:pPr>
-    </w:p>
-    <w:p>
-      <w:pPr>
-        <w:jc w:val="both"/>
-        <w:rPr>
-          <w:b/>
-          <w:bCs/>
-          <w:szCs w:val="24"/>
-        </w:rPr>
-      </w:pPr>
-      <w:r>
-        <w:rPr>
-          <w:b/>
-          <w:bCs/>
-          <w:szCs w:val="24"/>
-        </w:rPr>
-        <w:t xml:space="preserve">General </w:t>
-      </w:r>
-    </w:p>
-    <w:p>
-      <w:pPr>
-        <w:jc w:val="both"/>
-        <w:rPr>
-          <w:szCs w:val="24"/>
-        </w:rPr>
-      </w:pPr>
-    </w:p>
-    <w:p>
-      <w:pPr>
-        <w:jc w:val="both"/>
-        <w:rPr>
-          <w:szCs w:val="24"/>
-        </w:rPr>
-      </w:pPr>
-      <w:r>
-        <w:rPr>
-          <w:szCs w:val="24"/>
-        </w:rPr>
-        <w:t>Se debe colocar el objetivo que se busca con el desarrollo de la actividad, el cual debe arrancar con un verbo en infinitivo.</w:t>
-      </w:r>
-    </w:p>
-    <w:p>
-      <w:pPr>
-        <w:jc w:val="both"/>
-        <w:rPr>
-          <w:szCs w:val="24"/>
-        </w:rPr>
-      </w:pPr>
-    </w:p>
-    <w:p>
-      <w:pPr>
-        <w:jc w:val="both"/>
-        <w:rPr>
-          <w:b/>
-          <w:bCs/>
-          <w:szCs w:val="24"/>
-        </w:rPr>
-      </w:pPr>
-      <w:r>
-        <w:rPr>
-          <w:b/>
-          <w:bCs/>
-          <w:szCs w:val="24"/>
-        </w:rPr>
-        <w:t>Específicos</w:t>
-      </w:r>
-    </w:p>
-    <w:p>
-      <w:pPr>
-        <w:jc w:val="both"/>
-        <w:rPr>
-          <w:szCs w:val="24"/>
-        </w:rPr>
-      </w:pPr>
-    </w:p>
-    <w:p>
-      <w:pPr>
-        <w:jc w:val="both"/>
-        <w:rPr>
-          <w:szCs w:val="24"/>
-        </w:rPr>
-      </w:pPr>
-      <w:r>
-        <w:rPr>
-          <w:szCs w:val="24"/>
-        </w:rPr>
-        <w:t>Acá deben ir 2 o más objetivos que la ser desarrollados separadamente, dan solución al objetivo general, estos también deben arrancar con un verbo en infinitivo y listarse con viñetas.</w:t>
-      </w:r>
-    </w:p>
-    <w:p>
-      <w:pPr>
-        <w:rPr>
-          <w:szCs w:val="24"/>
-        </w:rPr>
-      </w:pPr>
-    </w:p>
-    <w:p>
-      <w:pPr>
-        <w:shd w:val="clear" w:color="auto" w:fill="FFFFFF"/>
-        <w:spacing w:after="100" w:afterAutospacing="1" w:line="240" w:lineRule="auto"/>
-        <w:rPr>
-          <w:rFonts w:eastAsia="Times New Roman" w:cs="Segoe UI"/>
-          <w:color w:val="212529"/>
-          <w:szCs w:val="24"/>
-          <w:lang w:eastAsia="es-CO"/>
-        </w:rPr>
-      </w:pPr>
-      <w:r>
-        <w:rPr>
-          <w:rFonts w:eastAsia="Times New Roman" w:cs="Segoe UI"/>
-          <w:b/>
-          <w:bCs/>
-          <w:color w:val="FF0000"/>
-          <w:szCs w:val="24"/>
-          <w:lang w:eastAsia="es-CO"/>
-        </w:rPr>
-        <w:t>¡Advertencia!</w:t>
-      </w:r>
-      <w:r>
-        <w:rPr>
-          <w:rFonts w:eastAsia="Times New Roman" w:cs="Segoe UI"/>
-          <w:b/>
-          <w:bCs/>
-          <w:color w:val="0000FF"/>
-          <w:szCs w:val="24"/>
-          <w:lang w:eastAsia="es-CO"/>
-        </w:rPr>
-        <w:t> Cuando tenga claras las anteriores instrucciones y haya configurado las normas, borre esta información y elabore los objetivos</w:t>
-      </w:r>
-    </w:p>
-    <w:p>
-      <w:pPr>
-        <w:rPr>
-          <w:szCs w:val="24"/>
-        </w:rPr>
-      </w:pPr>
+          <w:szCs w:val="24"/>
+        </w:rPr>
+      </w:pPr>
+      <w:r>
+        <w:rPr>
+          <w:szCs w:val="24"/>
+        </w:rPr>
+        <w:t>Publicar la página en internet para que todos puedan usarla y asegurarnos de que funcione bien, sin errores y cargando rápido.</w:t>
+      </w:r>
     </w:p>
     <w:p>
       <w:pPr>
@@ -1765,35 +1573,7 @@
         <w:rPr>
           <w:szCs w:val="24"/>
         </w:rPr>
-        <w:t xml:space="preserve"> pueden alojar en servicios gratuitos como GitHub Pages, </w:t>
-      </w:r>
-      <w:proofErr w:type="spellStart"/>
-      <w:r>
-        <w:rPr>
-          <w:szCs w:val="24"/>
-        </w:rPr>
-        <w:t>Netlify</w:t>
-      </w:r>
-      <w:proofErr w:type="spellEnd"/>
-      <w:r>
-        <w:rPr>
-          <w:szCs w:val="24"/>
-        </w:rPr>
-        <w:t xml:space="preserve"> o </w:t>
-      </w:r>
-      <w:proofErr w:type="spellStart"/>
-      <w:r>
-        <w:rPr>
-          <w:szCs w:val="24"/>
-        </w:rPr>
-        <w:t>Vercel</w:t>
-      </w:r>
-      <w:proofErr w:type="spellEnd"/>
-      <w:r>
-        <w:rPr>
-          <w:szCs w:val="24"/>
-        </w:rPr>
-        <w:t>.</w:t>
+        <w:t xml:space="preserve"> pueden alojar en servicios gratuitos como GitHub Pages, Netlify o Vercel.</w:t>
       </w:r>
     </w:p>
     <w:p>
@@ -3156,23 +2936,7 @@
           <w:rFonts w:eastAsia="Times New Roman" w:cs="Times New Roman"/>
           <w:szCs w:val="24"/>
         </w:rPr>
-        <w:t xml:space="preserve">Sección para la compra de </w:t>
-      </w:r>
-      <w:proofErr w:type="gramStart"/>
-      <w:r>
-        <w:rPr>
-          <w:rFonts w:eastAsia="Times New Roman" w:cs="Times New Roman"/>
-          <w:szCs w:val="24"/>
-        </w:rPr>
-        <w:t>tickets</w:t>
-      </w:r>
-      <w:proofErr w:type="gramEnd"/>
-      <w:r>
-        <w:rPr>
-          <w:rFonts w:eastAsia="Times New Roman" w:cs="Times New Roman"/>
-          <w:szCs w:val="24"/>
-        </w:rPr>
-        <w:t xml:space="preserve"> en línea, con diferentes métodos de pago.</w:t>
+        <w:t>Sección para la compra de tickets en línea, con diferentes métodos de pago.</w:t>
       </w:r>
     </w:p>
     <w:p>
@@ -3364,7 +3128,6 @@
           <w:szCs w:val="24"/>
         </w:rPr>
       </w:pPr>
-      <w:proofErr w:type="spellStart"/>
       <w:r>
         <w:rPr>
           <w:rFonts w:eastAsia="Times New Roman" w:cs="Times New Roman"/>
@@ -3372,7 +3135,6 @@
         </w:rPr>
         <w:t>Canva</w:t>
       </w:r>
-      <w:proofErr w:type="spellEnd"/>
       <w:r>
         <w:rPr>
           <w:rFonts w:eastAsia="Times New Roman" w:cs="Times New Roman"/>
@@ -4113,18 +3875,26 @@
         <w:jc w:val="both"/>
         <w:rPr>
           <w:rFonts w:eastAsia="Times New Roman" w:cs="Times New Roman"/>
-          <w:b/>
-          <w:bCs/>
-          <w:szCs w:val="24"/>
-        </w:rPr>
-      </w:pPr>
+          <w:szCs w:val="24"/>
+        </w:rPr>
+      </w:pPr>
+      <w:hyperlink r:id="rId17" w:history="1">
+        <w:r>
+          <w:rPr>
+            <w:rStyle w:val="Hipervnculo"/>
+            <w:rFonts w:eastAsia="Times New Roman" w:cs="Times New Roman"/>
+            <w:szCs w:val="24"/>
+          </w:rPr>
+          <w:t>https://germanrole98.github.io/terminal-transporte/</w:t>
+        </w:r>
+      </w:hyperlink>
     </w:p>
     <w:p>
       <w:pPr>
         <w:pStyle w:val="Prrafodelista"/>
         <w:numPr>
           <w:ilvl w:val="0"/>
-          <w:numId w:val="29"/>
+          <w:numId w:val="30"/>
         </w:numPr>
         <w:jc w:val="both"/>
         <w:rPr>
@@ -4156,7 +3926,7 @@
           <w:szCs w:val="24"/>
         </w:rPr>
       </w:pPr>
-      <w:hyperlink r:id="rId17" w:history="1">
+      <w:hyperlink r:id="rId18" w:history="1">
         <w:r>
           <w:rPr>
             <w:rStyle w:val="Hipervnculo"/>
@@ -4213,7 +3983,7 @@
           <w:szCs w:val="24"/>
         </w:rPr>
       </w:pPr>
-      <w:hyperlink r:id="rId18" w:history="1">
+      <w:hyperlink r:id="rId19" w:history="1">
         <w:r>
           <w:rPr>
             <w:rStyle w:val="Hipervnculo"/>
@@ -4246,12 +4016,208 @@
           <w:szCs w:val="24"/>
         </w:rPr>
       </w:pPr>
-      <w:r>
+    </w:p>
+    <w:p>
+      <w:pPr>
+        <w:pStyle w:val="Prrafodelista"/>
+        <w:spacing w:line="480" w:lineRule="auto"/>
+        <w:ind w:left="360"/>
+        <w:jc w:val="center"/>
         <w:rPr>
           <w:rFonts w:cs="Times New Roman"/>
           <w:b/>
           <w:szCs w:val="24"/>
         </w:rPr>
+      </w:pPr>
+    </w:p>
+    <w:p>
+      <w:pPr>
+        <w:pStyle w:val="Prrafodelista"/>
+        <w:spacing w:line="480" w:lineRule="auto"/>
+        <w:ind w:left="360"/>
+        <w:jc w:val="center"/>
+        <w:rPr>
+          <w:rFonts w:cs="Times New Roman"/>
+          <w:b/>
+          <w:szCs w:val="24"/>
+        </w:rPr>
+      </w:pPr>
+    </w:p>
+    <w:p>
+      <w:pPr>
+        <w:pStyle w:val="Prrafodelista"/>
+        <w:spacing w:line="480" w:lineRule="auto"/>
+        <w:ind w:left="360"/>
+        <w:jc w:val="center"/>
+        <w:rPr>
+          <w:rFonts w:cs="Times New Roman"/>
+          <w:b/>
+          <w:szCs w:val="24"/>
+        </w:rPr>
+      </w:pPr>
+    </w:p>
+    <w:p>
+      <w:pPr>
+        <w:pStyle w:val="Prrafodelista"/>
+        <w:spacing w:line="480" w:lineRule="auto"/>
+        <w:ind w:left="360"/>
+        <w:jc w:val="center"/>
+        <w:rPr>
+          <w:rFonts w:cs="Times New Roman"/>
+          <w:b/>
+          <w:szCs w:val="24"/>
+        </w:rPr>
+      </w:pPr>
+    </w:p>
+    <w:p>
+      <w:pPr>
+        <w:pStyle w:val="Prrafodelista"/>
+        <w:spacing w:line="480" w:lineRule="auto"/>
+        <w:ind w:left="360"/>
+        <w:jc w:val="center"/>
+        <w:rPr>
+          <w:rFonts w:cs="Times New Roman"/>
+          <w:b/>
+          <w:szCs w:val="24"/>
+        </w:rPr>
+      </w:pPr>
+    </w:p>
+    <w:p>
+      <w:pPr>
+        <w:pStyle w:val="Prrafodelista"/>
+        <w:spacing w:line="480" w:lineRule="auto"/>
+        <w:ind w:left="360"/>
+        <w:jc w:val="center"/>
+        <w:rPr>
+          <w:rFonts w:cs="Times New Roman"/>
+          <w:b/>
+          <w:szCs w:val="24"/>
+        </w:rPr>
+      </w:pPr>
+    </w:p>
+    <w:p>
+      <w:pPr>
+        <w:pStyle w:val="Prrafodelista"/>
+        <w:spacing w:line="480" w:lineRule="auto"/>
+        <w:ind w:left="360"/>
+        <w:jc w:val="center"/>
+        <w:rPr>
+          <w:rFonts w:cs="Times New Roman"/>
+          <w:b/>
+          <w:szCs w:val="24"/>
+        </w:rPr>
+      </w:pPr>
+    </w:p>
+    <w:p>
+      <w:pPr>
+        <w:pStyle w:val="Prrafodelista"/>
+        <w:spacing w:line="480" w:lineRule="auto"/>
+        <w:ind w:left="360"/>
+        <w:jc w:val="center"/>
+        <w:rPr>
+          <w:rFonts w:cs="Times New Roman"/>
+          <w:b/>
+          <w:szCs w:val="24"/>
+        </w:rPr>
+      </w:pPr>
+    </w:p>
+    <w:p>
+      <w:pPr>
+        <w:pStyle w:val="Prrafodelista"/>
+        <w:spacing w:line="480" w:lineRule="auto"/>
+        <w:ind w:left="360"/>
+        <w:jc w:val="center"/>
+        <w:rPr>
+          <w:rFonts w:cs="Times New Roman"/>
+          <w:b/>
+          <w:szCs w:val="24"/>
+        </w:rPr>
+      </w:pPr>
+    </w:p>
+    <w:p>
+      <w:pPr>
+        <w:pStyle w:val="Prrafodelista"/>
+        <w:spacing w:line="480" w:lineRule="auto"/>
+        <w:ind w:left="360"/>
+        <w:jc w:val="center"/>
+        <w:rPr>
+          <w:rFonts w:cs="Times New Roman"/>
+          <w:b/>
+          <w:szCs w:val="24"/>
+        </w:rPr>
+      </w:pPr>
+    </w:p>
+    <w:p>
+      <w:pPr>
+        <w:pStyle w:val="Prrafodelista"/>
+        <w:spacing w:line="480" w:lineRule="auto"/>
+        <w:ind w:left="360"/>
+        <w:jc w:val="center"/>
+        <w:rPr>
+          <w:rFonts w:cs="Times New Roman"/>
+          <w:b/>
+          <w:szCs w:val="24"/>
+        </w:rPr>
+      </w:pPr>
+    </w:p>
+    <w:p>
+      <w:pPr>
+        <w:pStyle w:val="Prrafodelista"/>
+        <w:spacing w:line="480" w:lineRule="auto"/>
+        <w:ind w:left="360"/>
+        <w:jc w:val="center"/>
+        <w:rPr>
+          <w:rFonts w:cs="Times New Roman"/>
+          <w:b/>
+          <w:szCs w:val="24"/>
+        </w:rPr>
+      </w:pPr>
+    </w:p>
+    <w:p>
+      <w:pPr>
+        <w:pStyle w:val="Prrafodelista"/>
+        <w:spacing w:line="480" w:lineRule="auto"/>
+        <w:ind w:left="360"/>
+        <w:jc w:val="center"/>
+        <w:rPr>
+          <w:rFonts w:cs="Times New Roman"/>
+          <w:b/>
+          <w:szCs w:val="24"/>
+        </w:rPr>
+      </w:pPr>
+    </w:p>
+    <w:p>
+      <w:pPr>
+        <w:pStyle w:val="Prrafodelista"/>
+        <w:spacing w:line="480" w:lineRule="auto"/>
+        <w:ind w:left="360"/>
+        <w:jc w:val="center"/>
+        <w:rPr>
+          <w:rFonts w:cs="Times New Roman"/>
+          <w:b/>
+          <w:szCs w:val="24"/>
+        </w:rPr>
+      </w:pPr>
+    </w:p>
+    <w:p>
+      <w:pPr>
+        <w:pStyle w:val="Prrafodelista"/>
+        <w:spacing w:line="480" w:lineRule="auto"/>
+        <w:ind w:left="360"/>
+        <w:jc w:val="center"/>
+        <w:rPr>
+          <w:rFonts w:cs="Times New Roman"/>
+          <w:b/>
+          <w:szCs w:val="24"/>
+        </w:rPr>
+      </w:pPr>
+      <w:r>
+        <w:rPr>
+          <w:rFonts w:cs="Times New Roman"/>
+          <w:b/>
+          <w:szCs w:val="24"/>
+        </w:rPr>
+        <w:lastRenderedPageBreak/>
         <w:t>Conclusiones</w:t>
       </w:r>
     </w:p>
@@ -4269,13 +4235,27 @@
           <w:rFonts w:cs="Times New Roman"/>
           <w:szCs w:val="24"/>
         </w:rPr>
-        <w:t>Corresponde a la etapa final de un texto en la que se presenta la información más relevante o aquello que se propone como ‘nuevo’ en el texto. En otras palabras, la conclusión es “a la que se llega después de considerar una serie de datos o circunstancias” (RAE). De hecho, concluir es definido como “inferir, deducir una verdad de otras que se admiten, demuestran o presuponen” (RAE). Por lo tanto, la conclusión está en directa relación con algo que se admitió, propuso o evidenció anteriormente en la introducción y el desarrollo del texto. Así, en la conclusión se reitera la tesis que se defendió en el texto o la idea que se abordó en el trabajo; se da respuesta a las preguntas iniciales o se revisa el cumplimiento de los objetivos presentados a la luz de lo elaborado en el desarrollo. De esta manera, podemos concebir la introducción como “un reflejo de la introducción”, pero con la información nueva que el trabajo desarrolla. “la conclusión corresponde al reflejo de la introducción”.</w:t>
-      </w:r>
-    </w:p>
-    <w:p>
-      <w:pPr>
-        <w:shd w:val="clear" w:color="auto" w:fill="FFFFFF"/>
-        <w:spacing w:after="100" w:afterAutospacing="1" w:line="240" w:lineRule="auto"/>
+        <w:t>Al crear una página web estática, logramos darle a la terminal una herramienta efectiva</w:t>
+      </w:r>
+      <w:r>
+        <w:rPr>
+          <w:rFonts w:cs="Times New Roman"/>
+          <w:szCs w:val="24"/>
+        </w:rPr>
+        <w:t xml:space="preserve"> y </w:t>
+      </w:r>
+      <w:r>
+        <w:rPr>
+          <w:rFonts w:cs="Times New Roman"/>
+          <w:szCs w:val="24"/>
+        </w:rPr>
+        <w:t>rápida. La web ahora puede mostrar a los usuarios la información de manera sencilla, lo que resuelve la mayoría de los inconvenientes.</w:t>
+      </w:r>
+    </w:p>
+    <w:p>
+      <w:pPr>
+        <w:spacing w:line="276" w:lineRule="auto"/>
+        <w:jc w:val="both"/>
         <w:rPr>
           <w:rFonts w:eastAsia="Times New Roman" w:cs="Segoe UI"/>
           <w:color w:val="212529"/>
@@ -4285,25 +4265,17 @@
       </w:pPr>
       <w:r>
         <w:rPr>
-          <w:rFonts w:eastAsia="Times New Roman" w:cs="Segoe UI"/>
-          <w:b/>
-          <w:bCs/>
-          <w:color w:val="FF0000"/>
-          <w:szCs w:val="24"/>
-          <w:lang w:eastAsia="es-CO"/>
-        </w:rPr>
-        <w:t>¡Advertencia!</w:t>
-      </w:r>
-      <w:r>
-        <w:rPr>
-          <w:rFonts w:eastAsia="Times New Roman" w:cs="Segoe UI"/>
-          <w:b/>
-          <w:bCs/>
-          <w:color w:val="0000FF"/>
-          <w:szCs w:val="24"/>
-          <w:lang w:eastAsia="es-CO"/>
-        </w:rPr>
-        <w:t> Cuando tenga claras las anteriores instrucciones y haya configurado el documento con las normas APA 7.0, borre esta información</w:t>
+          <w:rFonts w:cs="Times New Roman"/>
+          <w:szCs w:val="24"/>
+        </w:rPr>
+        <w:t>La</w:t>
+      </w:r>
+      <w:r>
+        <w:rPr>
+          <w:rFonts w:cs="Times New Roman"/>
+          <w:szCs w:val="24"/>
+        </w:rPr>
+        <w:t xml:space="preserve"> página cumple con las necesidades más importantes. Esto demuestra cómo una solución de bajo costo y fácil de mantener puede usar la tecnología para mejorar mucho la vida de las personas.</w:t>
       </w:r>
     </w:p>
     <w:p>
@@ -4378,7 +4350,7 @@
         </w:rPr>
         <w:t xml:space="preserve">. (s. f.). </w:t>
       </w:r>
-      <w:hyperlink r:id="rId19" w:history="1">
+      <w:hyperlink r:id="rId20" w:history="1">
         <w:r>
           <w:rPr>
             <w:rStyle w:val="Hipervnculo"/>
@@ -4421,7 +4393,7 @@
         </w:rPr>
         <w:t xml:space="preserve">. ES Tutoriales. </w:t>
       </w:r>
-      <w:hyperlink r:id="rId20" w:history="1">
+      <w:hyperlink r:id="rId21" w:history="1">
         <w:r>
           <w:rPr>
             <w:rStyle w:val="Hipervnculo"/>
@@ -4462,25 +4434,9 @@
           <w:rFonts w:ascii="Verdana" w:hAnsi="Verdana" w:cs="Times New Roman"/>
           <w:color w:val="000000"/>
         </w:rPr>
-        <w:t xml:space="preserve">. Guías Para Sitios Web, </w:t>
-      </w:r>
-      <w:proofErr w:type="spellStart"/>
-      <w:r>
-        <w:rPr>
-          <w:rFonts w:ascii="Verdana" w:hAnsi="Verdana" w:cs="Times New Roman"/>
-          <w:color w:val="000000"/>
-        </w:rPr>
-        <w:t>Tips</w:t>
-      </w:r>
-      <w:proofErr w:type="spellEnd"/>
-      <w:r>
-        <w:rPr>
-          <w:rFonts w:ascii="Verdana" w:hAnsi="Verdana" w:cs="Times New Roman"/>
-          <w:color w:val="000000"/>
-        </w:rPr>
-        <w:t xml:space="preserve"> &amp; Conocimiento. </w:t>
-      </w:r>
-      <w:hyperlink r:id="rId21" w:history="1">
+        <w:t xml:space="preserve">. Guías Para Sitios Web, Tips &amp; Conocimiento. </w:t>
+      </w:r>
+      <w:hyperlink r:id="rId22" w:history="1">
         <w:r>
           <w:rPr>
             <w:rStyle w:val="Hipervnculo"/>
@@ -4514,19 +4470,8 @@
           <w:iCs/>
           <w:color w:val="000000"/>
         </w:rPr>
-        <w:t>Blog del E-</w:t>
-      </w:r>
-      <w:proofErr w:type="spellStart"/>
-      <w:r>
-        <w:rPr>
-          <w:rFonts w:ascii="Verdana" w:hAnsi="Verdana" w:cs="Times New Roman"/>
-          <w:i/>
-          <w:iCs/>
-          <w:color w:val="000000"/>
-        </w:rPr>
-        <w:t>commerce</w:t>
-      </w:r>
-      <w:proofErr w:type="spellEnd"/>
+        <w:t>Blog del E-commerce</w:t>
+      </w:r>
       <w:r>
         <w:rPr>
           <w:rFonts w:ascii="Verdana" w:hAnsi="Verdana" w:cs="Times New Roman"/>
@@ -4534,7 +4479,7 @@
         </w:rPr>
         <w:t xml:space="preserve">. </w:t>
       </w:r>
-      <w:hyperlink r:id="rId22" w:history="1">
+      <w:hyperlink r:id="rId23" w:history="1">
         <w:r>
           <w:rPr>
             <w:rStyle w:val="Hipervnculo"/>
@@ -4546,12 +4491,12 @@
     </w:p>
     <w:p/>
     <w:sectPr>
-      <w:headerReference w:type="even" r:id="rId23"/>
-      <w:headerReference w:type="default" r:id="rId24"/>
-      <w:footerReference w:type="even" r:id="rId25"/>
-      <w:footerReference w:type="default" r:id="rId26"/>
-      <w:headerReference w:type="first" r:id="rId27"/>
-      <w:footerReference w:type="first" r:id="rId28"/>
+      <w:headerReference w:type="even" r:id="rId24"/>
+      <w:headerReference w:type="default" r:id="rId25"/>
+      <w:footerReference w:type="even" r:id="rId26"/>
+      <w:footerReference w:type="default" r:id="rId27"/>
+      <w:headerReference w:type="first" r:id="rId28"/>
+      <w:footerReference w:type="first" r:id="rId29"/>
       <w:pgSz w:w="12240" w:h="15840"/>
       <w:pgMar w:top="1701" w:right="1701" w:bottom="567" w:left="1701" w:header="709" w:footer="709" w:gutter="0"/>
       <w:cols w:space="708"/>
@@ -4962,6 +4907,119 @@
     </w:lvl>
   </w:abstractNum>
   <w:abstractNum w:abstractNumId="1" w15:restartNumberingAfterBreak="0">
+    <w:nsid w:val="029E1312"/>
+    <w:multiLevelType w:val="hybridMultilevel"/>
+    <w:tmpl w:val="A5007FDC"/>
+    <w:lvl w:ilvl="0" w:tplc="240A0001">
+      <w:start w:val="1"/>
+      <w:numFmt w:val="bullet"/>
+      <w:lvlText w:val=""/>
+      <w:lvlJc w:val="left"/>
+      <w:pPr>
+        <w:ind w:left="720" w:hanging="360"/>
+      </w:pPr>
+      <w:rPr>
+        <w:rFonts w:ascii="Symbol" w:hAnsi="Symbol" w:hint="default"/>
+      </w:rPr>
+    </w:lvl>
+    <w:lvl w:ilvl="1" w:tplc="240A0003" w:tentative="1">
+      <w:start w:val="1"/>
+      <w:numFmt w:val="bullet"/>
+      <w:lvlText w:val="o"/>
+      <w:lvlJc w:val="left"/>
+      <w:pPr>
+        <w:ind w:left="1440" w:hanging="360"/>
+      </w:pPr>
+      <w:rPr>
+        <w:rFonts w:ascii="Courier New" w:hAnsi="Courier New" w:cs="Courier New" w:hint="default"/>
+      </w:rPr>
+    </w:lvl>
+    <w:lvl w:ilvl="2" w:tplc="240A0005" w:tentative="1">
+      <w:start w:val="1"/>
+      <w:numFmt w:val="bullet"/>
+      <w:lvlText w:val=""/>
+      <w:lvlJc w:val="left"/>
+      <w:pPr>
+        <w:ind w:left="2160" w:hanging="360"/>
+      </w:pPr>
+      <w:rPr>
+        <w:rFonts w:ascii="Wingdings" w:hAnsi="Wingdings" w:hint="default"/>
+      </w:rPr>
+    </w:lvl>
+    <w:lvl w:ilvl="3" w:tplc="240A0001" w:tentative="1">
+      <w:start w:val="1"/>
+      <w:numFmt w:val="bullet"/>
+      <w:lvlText w:val=""/>
+      <w:lvlJc w:val="left"/>
+      <w:pPr>
+        <w:ind w:left="2880" w:hanging="360"/>
+      </w:pPr>
+      <w:rPr>
+        <w:rFonts w:ascii="Symbol" w:hAnsi="Symbol" w:hint="default"/>
+      </w:rPr>
+    </w:lvl>
+    <w:lvl w:ilvl="4" w:tplc="240A0003" w:tentative="1">
+      <w:start w:val="1"/>
+      <w:numFmt w:val="bullet"/>
+      <w:lvlText w:val="o"/>
+      <w:lvlJc w:val="left"/>
+      <w:pPr>
+        <w:ind w:left="3600" w:hanging="360"/>
+      </w:pPr>
+      <w:rPr>
+        <w:rFonts w:ascii="Courier New" w:hAnsi="Courier New" w:cs="Courier New" w:hint="default"/>
+      </w:rPr>
+    </w:lvl>
+    <w:lvl w:ilvl="5" w:tplc="240A0005" w:tentative="1">
+      <w:start w:val="1"/>
+      <w:numFmt w:val="bullet"/>
+      <w:lvlText w:val=""/>
+      <w:lvlJc w:val="left"/>
+      <w:pPr>
+        <w:ind w:left="4320" w:hanging="360"/>
+      </w:pPr>
+      <w:rPr>
+        <w:rFonts w:ascii="Wingdings" w:hAnsi="Wingdings" w:hint="default"/>
+      </w:rPr>
+    </w:lvl>
+    <w:lvl w:ilvl="6" w:tplc="240A0001" w:tentative="1">
+      <w:start w:val="1"/>
+      <w:numFmt w:val="bullet"/>
+      <w:lvlText w:val=""/>
+      <w:lvlJc w:val="left"/>
+      <w:pPr>
+        <w:ind w:left="5040" w:hanging="360"/>
+      </w:pPr>
+      <w:rPr>
+        <w:rFonts w:ascii="Symbol" w:hAnsi="Symbol" w:hint="default"/>
+      </w:rPr>
+    </w:lvl>
+    <w:lvl w:ilvl="7" w:tplc="240A0003" w:tentative="1">
+      <w:start w:val="1"/>
+      <w:numFmt w:val="bullet"/>
+      <w:lvlText w:val="o"/>
+      <w:lvlJc w:val="left"/>
+      <w:pPr>
+        <w:ind w:left="5760" w:hanging="360"/>
+      </w:pPr>
+      <w:rPr>
+        <w:rFonts w:ascii="Courier New" w:hAnsi="Courier New" w:cs="Courier New" w:hint="default"/>
+      </w:rPr>
+    </w:lvl>
+    <w:lvl w:ilvl="8" w:tplc="240A0005" w:tentative="1">
+      <w:start w:val="1"/>
+      <w:numFmt w:val="bullet"/>
+      <w:lvlText w:val=""/>
+      <w:lvlJc w:val="left"/>
+      <w:pPr>
+        <w:ind w:left="6480" w:hanging="360"/>
+      </w:pPr>
+      <w:rPr>
+        <w:rFonts w:ascii="Wingdings" w:hAnsi="Wingdings" w:hint="default"/>
+      </w:rPr>
+    </w:lvl>
+  </w:abstractNum>
+  <w:abstractNum w:abstractNumId="2" w15:restartNumberingAfterBreak="0">
     <w:nsid w:val="0857253D"/>
     <w:multiLevelType w:val="hybridMultilevel"/>
     <w:tmpl w:val="B8F62D0C"/>
@@ -5050,7 +5108,7 @@
       </w:pPr>
     </w:lvl>
   </w:abstractNum>
-  <w:abstractNum w:abstractNumId="2" w15:restartNumberingAfterBreak="0">
+  <w:abstractNum w:abstractNumId="3" w15:restartNumberingAfterBreak="0">
     <w:nsid w:val="129108BF"/>
     <w:multiLevelType w:val="hybridMultilevel"/>
     <w:tmpl w:val="CF56C21C"/>
@@ -5163,7 +5221,7 @@
       </w:rPr>
     </w:lvl>
   </w:abstractNum>
-  <w:abstractNum w:abstractNumId="3" w15:restartNumberingAfterBreak="0">
+  <w:abstractNum w:abstractNumId="4" w15:restartNumberingAfterBreak="0">
     <w:nsid w:val="18012484"/>
     <w:multiLevelType w:val="hybridMultilevel"/>
     <w:tmpl w:val="D310AE14"/>
@@ -5252,7 +5310,7 @@
       </w:pPr>
     </w:lvl>
   </w:abstractNum>
-  <w:abstractNum w:abstractNumId="4" w15:restartNumberingAfterBreak="0">
+  <w:abstractNum w:abstractNumId="5" w15:restartNumberingAfterBreak="0">
     <w:nsid w:val="1B664A24"/>
     <w:multiLevelType w:val="hybridMultilevel"/>
     <w:tmpl w:val="01CA1B86"/>
@@ -5341,7 +5399,7 @@
       </w:pPr>
     </w:lvl>
   </w:abstractNum>
-  <w:abstractNum w:abstractNumId="5" w15:restartNumberingAfterBreak="0">
+  <w:abstractNum w:abstractNumId="6" w15:restartNumberingAfterBreak="0">
     <w:nsid w:val="1EE20E55"/>
     <w:multiLevelType w:val="hybridMultilevel"/>
     <w:tmpl w:val="198C6F24"/>
@@ -5454,7 +5512,7 @@
       </w:rPr>
     </w:lvl>
   </w:abstractNum>
-  <w:abstractNum w:abstractNumId="6" w15:restartNumberingAfterBreak="0">
+  <w:abstractNum w:abstractNumId="7" w15:restartNumberingAfterBreak="0">
     <w:nsid w:val="2FA20E70"/>
     <w:multiLevelType w:val="hybridMultilevel"/>
     <w:tmpl w:val="85FA681C"/>
@@ -5543,7 +5601,120 @@
       </w:pPr>
     </w:lvl>
   </w:abstractNum>
-  <w:abstractNum w:abstractNumId="7" w15:restartNumberingAfterBreak="0">
+  <w:abstractNum w:abstractNumId="8" w15:restartNumberingAfterBreak="0">
+    <w:nsid w:val="34710303"/>
+    <w:multiLevelType w:val="hybridMultilevel"/>
+    <w:tmpl w:val="61904790"/>
+    <w:lvl w:ilvl="0" w:tplc="240A0001">
+      <w:start w:val="1"/>
+      <w:numFmt w:val="bullet"/>
+      <w:lvlText w:val=""/>
+      <w:lvlJc w:val="left"/>
+      <w:pPr>
+        <w:ind w:left="720" w:hanging="360"/>
+      </w:pPr>
+      <w:rPr>
+        <w:rFonts w:ascii="Symbol" w:hAnsi="Symbol" w:hint="default"/>
+      </w:rPr>
+    </w:lvl>
+    <w:lvl w:ilvl="1" w:tplc="240A0003" w:tentative="1">
+      <w:start w:val="1"/>
+      <w:numFmt w:val="bullet"/>
+      <w:lvlText w:val="o"/>
+      <w:lvlJc w:val="left"/>
+      <w:pPr>
+        <w:ind w:left="1440" w:hanging="360"/>
+      </w:pPr>
+      <w:rPr>
+        <w:rFonts w:ascii="Courier New" w:hAnsi="Courier New" w:cs="Courier New" w:hint="default"/>
+      </w:rPr>
+    </w:lvl>
+    <w:lvl w:ilvl="2" w:tplc="240A0005" w:tentative="1">
+      <w:start w:val="1"/>
+      <w:numFmt w:val="bullet"/>
+      <w:lvlText w:val=""/>
+      <w:lvlJc w:val="left"/>
+      <w:pPr>
+        <w:ind w:left="2160" w:hanging="360"/>
+      </w:pPr>
+      <w:rPr>
+        <w:rFonts w:ascii="Wingdings" w:hAnsi="Wingdings" w:hint="default"/>
+      </w:rPr>
+    </w:lvl>
+    <w:lvl w:ilvl="3" w:tplc="240A0001" w:tentative="1">
+      <w:start w:val="1"/>
+      <w:numFmt w:val="bullet"/>
+      <w:lvlText w:val=""/>
+      <w:lvlJc w:val="left"/>
+      <w:pPr>
+        <w:ind w:left="2880" w:hanging="360"/>
+      </w:pPr>
+      <w:rPr>
+        <w:rFonts w:ascii="Symbol" w:hAnsi="Symbol" w:hint="default"/>
+      </w:rPr>
+    </w:lvl>
+    <w:lvl w:ilvl="4" w:tplc="240A0003" w:tentative="1">
+      <w:start w:val="1"/>
+      <w:numFmt w:val="bullet"/>
+      <w:lvlText w:val="o"/>
+      <w:lvlJc w:val="left"/>
+      <w:pPr>
+        <w:ind w:left="3600" w:hanging="360"/>
+      </w:pPr>
+      <w:rPr>
+        <w:rFonts w:ascii="Courier New" w:hAnsi="Courier New" w:cs="Courier New" w:hint="default"/>
+      </w:rPr>
+    </w:lvl>
+    <w:lvl w:ilvl="5" w:tplc="240A0005" w:tentative="1">
+      <w:start w:val="1"/>
+      <w:numFmt w:val="bullet"/>
+      <w:lvlText w:val=""/>
+      <w:lvlJc w:val="left"/>
+      <w:pPr>
+        <w:ind w:left="4320" w:hanging="360"/>
+      </w:pPr>
+      <w:rPr>
+        <w:rFonts w:ascii="Wingdings" w:hAnsi="Wingdings" w:hint="default"/>
+      </w:rPr>
+    </w:lvl>
+    <w:lvl w:ilvl="6" w:tplc="240A0001" w:tentative="1">
+      <w:start w:val="1"/>
+      <w:numFmt w:val="bullet"/>
+      <w:lvlText w:val=""/>
+      <w:lvlJc w:val="left"/>
+      <w:pPr>
+        <w:ind w:left="5040" w:hanging="360"/>
+      </w:pPr>
+      <w:rPr>
+        <w:rFonts w:ascii="Symbol" w:hAnsi="Symbol" w:hint="default"/>
+      </w:rPr>
+    </w:lvl>
+    <w:lvl w:ilvl="7" w:tplc="240A0003" w:tentative="1">
+      <w:start w:val="1"/>
+      <w:numFmt w:val="bullet"/>
+      <w:lvlText w:val="o"/>
+      <w:lvlJc w:val="left"/>
+      <w:pPr>
+        <w:ind w:left="5760" w:hanging="360"/>
+      </w:pPr>
+      <w:rPr>
+        <w:rFonts w:ascii="Courier New" w:hAnsi="Courier New" w:cs="Courier New" w:hint="default"/>
+      </w:rPr>
+    </w:lvl>
+    <w:lvl w:ilvl="8" w:tplc="240A0005" w:tentative="1">
+      <w:start w:val="1"/>
+      <w:numFmt w:val="bullet"/>
+      <w:lvlText w:val=""/>
+      <w:lvlJc w:val="left"/>
+      <w:pPr>
+        <w:ind w:left="6480" w:hanging="360"/>
+      </w:pPr>
+      <w:rPr>
+        <w:rFonts w:ascii="Wingdings" w:hAnsi="Wingdings" w:hint="default"/>
+      </w:rPr>
+    </w:lvl>
+  </w:abstractNum>
+  <w:abstractNum w:abstractNumId="9" w15:restartNumberingAfterBreak="0">
     <w:nsid w:val="386132BB"/>
     <w:multiLevelType w:val="hybridMultilevel"/>
     <w:tmpl w:val="0090D566"/>
@@ -5656,7 +5827,7 @@
       </w:rPr>
     </w:lvl>
   </w:abstractNum>
-  <w:abstractNum w:abstractNumId="8" w15:restartNumberingAfterBreak="0">
+  <w:abstractNum w:abstractNumId="10" w15:restartNumberingAfterBreak="0">
     <w:nsid w:val="38DA499A"/>
     <w:multiLevelType w:val="hybridMultilevel"/>
     <w:tmpl w:val="1388936C"/>
@@ -5769,7 +5940,7 @@
       </w:rPr>
     </w:lvl>
   </w:abstractNum>
-  <w:abstractNum w:abstractNumId="9" w15:restartNumberingAfterBreak="0">
+  <w:abstractNum w:abstractNumId="11" w15:restartNumberingAfterBreak="0">
     <w:nsid w:val="459948E6"/>
     <w:multiLevelType w:val="hybridMultilevel"/>
     <w:tmpl w:val="D9D8C0E4"/>
@@ -5882,7 +6053,7 @@
       </w:rPr>
     </w:lvl>
   </w:abstractNum>
-  <w:abstractNum w:abstractNumId="10" w15:restartNumberingAfterBreak="0">
+  <w:abstractNum w:abstractNumId="12" w15:restartNumberingAfterBreak="0">
     <w:nsid w:val="49742E19"/>
     <w:multiLevelType w:val="hybridMultilevel"/>
     <w:tmpl w:val="17486B3A"/>
@@ -5972,7 +6143,7 @@
       </w:pPr>
     </w:lvl>
   </w:abstractNum>
-  <w:abstractNum w:abstractNumId="11" w15:restartNumberingAfterBreak="0">
+  <w:abstractNum w:abstractNumId="13" w15:restartNumberingAfterBreak="0">
     <w:nsid w:val="49E75FE1"/>
     <w:multiLevelType w:val="hybridMultilevel"/>
     <w:tmpl w:val="17486B3A"/>
@@ -6062,7 +6233,7 @@
       </w:pPr>
     </w:lvl>
   </w:abstractNum>
-  <w:abstractNum w:abstractNumId="12" w15:restartNumberingAfterBreak="0">
+  <w:abstractNum w:abstractNumId="14" w15:restartNumberingAfterBreak="0">
     <w:nsid w:val="519349E8"/>
     <w:multiLevelType w:val="hybridMultilevel"/>
     <w:tmpl w:val="E9B0A3EE"/>
@@ -6151,7 +6322,7 @@
       </w:pPr>
     </w:lvl>
   </w:abstractNum>
-  <w:abstractNum w:abstractNumId="13" w15:restartNumberingAfterBreak="0">
+  <w:abstractNum w:abstractNumId="15" w15:restartNumberingAfterBreak="0">
     <w:nsid w:val="538D192A"/>
     <w:multiLevelType w:val="hybridMultilevel"/>
     <w:tmpl w:val="278EC020"/>
@@ -6237,7 +6408,7 @@
       </w:pPr>
     </w:lvl>
   </w:abstractNum>
-  <w:abstractNum w:abstractNumId="14" w15:restartNumberingAfterBreak="0">
+  <w:abstractNum w:abstractNumId="16" w15:restartNumberingAfterBreak="0">
     <w:nsid w:val="55C53EB3"/>
     <w:multiLevelType w:val="hybridMultilevel"/>
     <w:tmpl w:val="B8C2A1B4"/>
@@ -6350,7 +6521,7 @@
       </w:rPr>
     </w:lvl>
   </w:abstractNum>
-  <w:abstractNum w:abstractNumId="15" w15:restartNumberingAfterBreak="0">
+  <w:abstractNum w:abstractNumId="17" w15:restartNumberingAfterBreak="0">
     <w:nsid w:val="58DE7855"/>
     <w:multiLevelType w:val="hybridMultilevel"/>
     <w:tmpl w:val="3692E944"/>
@@ -6439,7 +6610,7 @@
       </w:pPr>
     </w:lvl>
   </w:abstractNum>
-  <w:abstractNum w:abstractNumId="16" w15:restartNumberingAfterBreak="0">
+  <w:abstractNum w:abstractNumId="18" w15:restartNumberingAfterBreak="0">
     <w:nsid w:val="5D891956"/>
     <w:multiLevelType w:val="hybridMultilevel"/>
     <w:tmpl w:val="62084E0C"/>
@@ -6552,7 +6723,7 @@
       </w:rPr>
     </w:lvl>
   </w:abstractNum>
-  <w:abstractNum w:abstractNumId="17" w15:restartNumberingAfterBreak="0">
+  <w:abstractNum w:abstractNumId="19" w15:restartNumberingAfterBreak="0">
     <w:nsid w:val="655B2148"/>
     <w:multiLevelType w:val="hybridMultilevel"/>
     <w:tmpl w:val="CD7A4A32"/>
@@ -6642,7 +6813,7 @@
       </w:pPr>
     </w:lvl>
   </w:abstractNum>
-  <w:abstractNum w:abstractNumId="18" w15:restartNumberingAfterBreak="0">
+  <w:abstractNum w:abstractNumId="20" w15:restartNumberingAfterBreak="0">
     <w:nsid w:val="65E13B61"/>
     <w:multiLevelType w:val="hybridMultilevel"/>
     <w:tmpl w:val="97808354"/>
@@ -6731,7 +6902,7 @@
       </w:pPr>
     </w:lvl>
   </w:abstractNum>
-  <w:abstractNum w:abstractNumId="19" w15:restartNumberingAfterBreak="0">
+  <w:abstractNum w:abstractNumId="21" w15:restartNumberingAfterBreak="0">
     <w:nsid w:val="66093213"/>
     <w:multiLevelType w:val="hybridMultilevel"/>
     <w:tmpl w:val="87124A44"/>
@@ -6844,7 +7015,7 @@
       </w:rPr>
     </w:lvl>
   </w:abstractNum>
-  <w:abstractNum w:abstractNumId="20" w15:restartNumberingAfterBreak="0">
+  <w:abstractNum w:abstractNumId="22" w15:restartNumberingAfterBreak="0">
     <w:nsid w:val="68177934"/>
     <w:multiLevelType w:val="hybridMultilevel"/>
     <w:tmpl w:val="FECA4406"/>
@@ -6930,7 +7101,7 @@
       </w:pPr>
     </w:lvl>
   </w:abstractNum>
-  <w:abstractNum w:abstractNumId="21" w15:restartNumberingAfterBreak="0">
+  <w:abstractNum w:abstractNumId="23" w15:restartNumberingAfterBreak="0">
     <w:nsid w:val="6DCD20FA"/>
     <w:multiLevelType w:val="hybridMultilevel"/>
     <w:tmpl w:val="A47C980A"/>
@@ -7043,7 +7214,7 @@
       </w:rPr>
     </w:lvl>
   </w:abstractNum>
-  <w:abstractNum w:abstractNumId="22" w15:restartNumberingAfterBreak="0">
+  <w:abstractNum w:abstractNumId="24" w15:restartNumberingAfterBreak="0">
     <w:nsid w:val="6F816E5D"/>
     <w:multiLevelType w:val="hybridMultilevel"/>
     <w:tmpl w:val="65F86864"/>
@@ -7156,7 +7327,7 @@
       </w:rPr>
     </w:lvl>
   </w:abstractNum>
-  <w:abstractNum w:abstractNumId="23" w15:restartNumberingAfterBreak="0">
+  <w:abstractNum w:abstractNumId="25" w15:restartNumberingAfterBreak="0">
     <w:nsid w:val="77747E3A"/>
     <w:multiLevelType w:val="hybridMultilevel"/>
     <w:tmpl w:val="8DA69BE8"/>
@@ -7269,7 +7440,7 @@
       </w:rPr>
     </w:lvl>
   </w:abstractNum>
-  <w:abstractNum w:abstractNumId="24" w15:restartNumberingAfterBreak="0">
+  <w:abstractNum w:abstractNumId="26" w15:restartNumberingAfterBreak="0">
     <w:nsid w:val="7B2D3C7D"/>
     <w:multiLevelType w:val="hybridMultilevel"/>
     <w:tmpl w:val="705E5B3E"/>
@@ -7382,7 +7553,7 @@
       </w:rPr>
     </w:lvl>
   </w:abstractNum>
-  <w:abstractNum w:abstractNumId="25" w15:restartNumberingAfterBreak="0">
+  <w:abstractNum w:abstractNumId="27" w15:restartNumberingAfterBreak="0">
     <w:nsid w:val="7B9D08C9"/>
     <w:multiLevelType w:val="hybridMultilevel"/>
     <w:tmpl w:val="425044E0"/>
@@ -7495,7 +7666,7 @@
       </w:rPr>
     </w:lvl>
   </w:abstractNum>
-  <w:abstractNum w:abstractNumId="26" w15:restartNumberingAfterBreak="0">
+  <w:abstractNum w:abstractNumId="28" w15:restartNumberingAfterBreak="0">
     <w:nsid w:val="7C372E33"/>
     <w:multiLevelType w:val="multilevel"/>
     <w:tmpl w:val="275415A2"/>
@@ -7581,7 +7752,7 @@
       </w:pPr>
     </w:lvl>
   </w:abstractNum>
-  <w:abstractNum w:abstractNumId="27" w15:restartNumberingAfterBreak="0">
+  <w:abstractNum w:abstractNumId="29" w15:restartNumberingAfterBreak="0">
     <w:nsid w:val="7D9D4AEF"/>
     <w:multiLevelType w:val="hybridMultilevel"/>
     <w:tmpl w:val="D9AC5DB8"/>
@@ -7694,7 +7865,7 @@
       </w:rPr>
     </w:lvl>
   </w:abstractNum>
-  <w:abstractNum w:abstractNumId="28" w15:restartNumberingAfterBreak="0">
+  <w:abstractNum w:abstractNumId="30" w15:restartNumberingAfterBreak="0">
     <w:nsid w:val="7E246E06"/>
     <w:multiLevelType w:val="hybridMultilevel"/>
     <w:tmpl w:val="3118C404"/>
@@ -7808,91 +7979,97 @@
     </w:lvl>
   </w:abstractNum>
   <w:num w:numId="1" w16cid:durableId="868225257">
-    <w:abstractNumId w:val="3"/>
+    <w:abstractNumId w:val="4"/>
   </w:num>
   <w:num w:numId="2" w16cid:durableId="885488798">
     <w:abstractNumId w:val="0"/>
   </w:num>
   <w:num w:numId="3" w16cid:durableId="772017285">
+    <w:abstractNumId w:val="16"/>
+  </w:num>
+  <w:num w:numId="4" w16cid:durableId="1527018344">
     <w:abstractNumId w:val="14"/>
   </w:num>
-  <w:num w:numId="4" w16cid:durableId="1527018344">
+  <w:num w:numId="5" w16cid:durableId="69813075">
+    <w:abstractNumId w:val="5"/>
+  </w:num>
+  <w:num w:numId="6" w16cid:durableId="2060737663">
+    <w:abstractNumId w:val="17"/>
+  </w:num>
+  <w:num w:numId="7" w16cid:durableId="242951485">
+    <w:abstractNumId w:val="13"/>
+  </w:num>
+  <w:num w:numId="8" w16cid:durableId="1816875666">
+    <w:abstractNumId w:val="28"/>
+  </w:num>
+  <w:num w:numId="9" w16cid:durableId="912086687">
+    <w:abstractNumId w:val="7"/>
+  </w:num>
+  <w:num w:numId="10" w16cid:durableId="1347094488">
+    <w:abstractNumId w:val="22"/>
+  </w:num>
+  <w:num w:numId="11" w16cid:durableId="609438630">
     <w:abstractNumId w:val="12"/>
   </w:num>
-  <w:num w:numId="5" w16cid:durableId="69813075">
-    <w:abstractNumId w:val="4"/>
+  <w:num w:numId="12" w16cid:durableId="1681659419">
+    <w:abstractNumId w:val="9"/>
   </w:num>
-  <w:num w:numId="6" w16cid:durableId="2060737663">
+  <w:num w:numId="13" w16cid:durableId="1975600476">
+    <w:abstractNumId w:val="21"/>
+  </w:num>
+  <w:num w:numId="14" w16cid:durableId="1685595849">
+    <w:abstractNumId w:val="30"/>
+  </w:num>
+  <w:num w:numId="15" w16cid:durableId="1057318062">
+    <w:abstractNumId w:val="29"/>
+  </w:num>
+  <w:num w:numId="16" w16cid:durableId="1495225790">
+    <w:abstractNumId w:val="18"/>
+  </w:num>
+  <w:num w:numId="17" w16cid:durableId="1207065215">
+    <w:abstractNumId w:val="19"/>
+  </w:num>
+  <w:num w:numId="18" w16cid:durableId="722868555">
+    <w:abstractNumId w:val="25"/>
+  </w:num>
+  <w:num w:numId="19" w16cid:durableId="736392799">
+    <w:abstractNumId w:val="2"/>
+  </w:num>
+  <w:num w:numId="20" w16cid:durableId="699549364">
+    <w:abstractNumId w:val="27"/>
+  </w:num>
+  <w:num w:numId="21" w16cid:durableId="1244297858">
+    <w:abstractNumId w:val="3"/>
+  </w:num>
+  <w:num w:numId="22" w16cid:durableId="1223521767">
+    <w:abstractNumId w:val="20"/>
+  </w:num>
+  <w:num w:numId="23" w16cid:durableId="1544635809">
+    <w:abstractNumId w:val="11"/>
+  </w:num>
+  <w:num w:numId="24" w16cid:durableId="1808931142">
     <w:abstractNumId w:val="15"/>
   </w:num>
-  <w:num w:numId="7" w16cid:durableId="242951485">
-    <w:abstractNumId w:val="11"/>
+  <w:num w:numId="25" w16cid:durableId="1707103580">
+    <w:abstractNumId w:val="24"/>
   </w:num>
-  <w:num w:numId="8" w16cid:durableId="1816875666">
+  <w:num w:numId="26" w16cid:durableId="1712804007">
+    <w:abstractNumId w:val="23"/>
+  </w:num>
+  <w:num w:numId="27" w16cid:durableId="1013144931">
     <w:abstractNumId w:val="26"/>
   </w:num>
-  <w:num w:numId="9" w16cid:durableId="912086687">
+  <w:num w:numId="28" w16cid:durableId="947932399">
+    <w:abstractNumId w:val="10"/>
+  </w:num>
+  <w:num w:numId="29" w16cid:durableId="125318474">
     <w:abstractNumId w:val="6"/>
   </w:num>
-  <w:num w:numId="10" w16cid:durableId="1347094488">
-    <w:abstractNumId w:val="20"/>
-  </w:num>
-  <w:num w:numId="11" w16cid:durableId="609438630">
-    <w:abstractNumId w:val="10"/>
-  </w:num>
-  <w:num w:numId="12" w16cid:durableId="1681659419">
-    <w:abstractNumId w:val="7"/>
-  </w:num>
-  <w:num w:numId="13" w16cid:durableId="1975600476">
-    <w:abstractNumId w:val="19"/>
-  </w:num>
-  <w:num w:numId="14" w16cid:durableId="1685595849">
-    <w:abstractNumId w:val="28"/>
-  </w:num>
-  <w:num w:numId="15" w16cid:durableId="1057318062">
-    <w:abstractNumId w:val="27"/>
-  </w:num>
-  <w:num w:numId="16" w16cid:durableId="1495225790">
-    <w:abstractNumId w:val="16"/>
-  </w:num>
-  <w:num w:numId="17" w16cid:durableId="1207065215">
-    <w:abstractNumId w:val="17"/>
-  </w:num>
-  <w:num w:numId="18" w16cid:durableId="722868555">
-    <w:abstractNumId w:val="23"/>
-  </w:num>
-  <w:num w:numId="19" w16cid:durableId="736392799">
+  <w:num w:numId="30" w16cid:durableId="886375470">
     <w:abstractNumId w:val="1"/>
   </w:num>
-  <w:num w:numId="20" w16cid:durableId="699549364">
-    <w:abstractNumId w:val="25"/>
-  </w:num>
-  <w:num w:numId="21" w16cid:durableId="1244297858">
-    <w:abstractNumId w:val="2"/>
-  </w:num>
-  <w:num w:numId="22" w16cid:durableId="1223521767">
-    <w:abstractNumId w:val="18"/>
-  </w:num>
-  <w:num w:numId="23" w16cid:durableId="1544635809">
-    <w:abstractNumId w:val="9"/>
-  </w:num>
-  <w:num w:numId="24" w16cid:durableId="1808931142">
-    <w:abstractNumId w:val="13"/>
-  </w:num>
-  <w:num w:numId="25" w16cid:durableId="1707103580">
-    <w:abstractNumId w:val="22"/>
-  </w:num>
-  <w:num w:numId="26" w16cid:durableId="1712804007">
-    <w:abstractNumId w:val="21"/>
-  </w:num>
-  <w:num w:numId="27" w16cid:durableId="1013144931">
-    <w:abstractNumId w:val="24"/>
-  </w:num>
-  <w:num w:numId="28" w16cid:durableId="947932399">
+  <w:num w:numId="31" w16cid:durableId="698160540">
     <w:abstractNumId w:val="8"/>
-  </w:num>
-  <w:num w:numId="29" w16cid:durableId="125318474">
-    <w:abstractNumId w:val="5"/>
   </w:num>
 </w:numbering>
 </file>

</xml_diff>